<commit_message>
Signed-off-by: Student George Tolkachov (TL_KCOMP_B_Y3) <t00262291@mymtu.ie>
</commit_message>
<xml_diff>
--- a/requirements/Requirements & Stakeholders - OOP.docx
+++ b/requirements/Requirements & Stakeholders - OOP.docx
@@ -4,29 +4,97 @@
   <w:body>
     <w:p>
       <w:pPr>
-        <w:rPr>
-          <w:sz w:val="40"/>
-          <w:szCs w:val="40"/>
+        <w:pStyle w:val="Heading2"/>
+        <w:jc w:val="center"/>
+        <w:rPr>
+          <w:rFonts w:ascii="Lato" w:hAnsi="Lato"/>
+          <w:b/>
+          <w:bCs/>
+          <w:sz w:val="48"/>
+          <w:szCs w:val="48"/>
         </w:rPr>
       </w:pPr>
       <w:r>
         <w:rPr>
-          <w:sz w:val="40"/>
-          <w:szCs w:val="40"/>
-        </w:rPr>
-        <w:t>Task 1: Classify Statements</w:t>
+          <w:rFonts w:ascii="Lato" w:hAnsi="Lato"/>
+          <w:b/>
+          <w:bCs/>
+          <w:sz w:val="48"/>
+          <w:szCs w:val="48"/>
+        </w:rPr>
+        <w:t>Regional Delivery Coordination Service</w:t>
+      </w:r>
+    </w:p>
+    <w:p>
+      <w:pPr>
+        <w:pStyle w:val="Heading4"/>
+        <w:spacing w:line="276" w:lineRule="auto"/>
+        <w:jc w:val="right"/>
+        <w:rPr>
+          <w:color w:val="000000" w:themeColor="text1"/>
+          <w:sz w:val="32"/>
+          <w:szCs w:val="32"/>
+        </w:rPr>
+      </w:pPr>
+      <w:r>
+        <w:rPr>
+          <w:color w:val="000000" w:themeColor="text1"/>
+          <w:sz w:val="32"/>
+          <w:szCs w:val="32"/>
+        </w:rPr>
+        <w:t>Heorhii Tolkachov - T00262291</w:t>
+      </w:r>
+    </w:p>
+    <w:p/>
+    <w:p>
+      <w:pPr>
+        <w:pStyle w:val="Heading1"/>
+        <w:shd w:val="clear" w:color="auto" w:fill="FFFFFF"/>
+        <w:spacing w:before="90" w:after="90"/>
+        <w:rPr>
+          <w:rFonts w:ascii="Lato" w:hAnsi="Lato"/>
+          <w:color w:val="000000" w:themeColor="text1"/>
+        </w:rPr>
+      </w:pPr>
+      <w:r>
+        <w:rPr>
+          <w:rFonts w:ascii="Lato" w:hAnsi="Lato"/>
+          <w:color w:val="000000" w:themeColor="text1"/>
+        </w:rPr>
+        <w:t xml:space="preserve">Task </w:t>
+      </w:r>
+      <w:r>
+        <w:rPr>
+          <w:rFonts w:ascii="Lato" w:hAnsi="Lato"/>
+          <w:color w:val="000000" w:themeColor="text1"/>
+        </w:rPr>
+        <w:t>1</w:t>
+      </w:r>
+      <w:r>
+        <w:rPr>
+          <w:rFonts w:ascii="Lato" w:hAnsi="Lato"/>
+          <w:color w:val="000000" w:themeColor="text1"/>
+        </w:rPr>
+        <w:t xml:space="preserve">: </w:t>
+      </w:r>
+      <w:r>
+        <w:rPr>
+          <w:rFonts w:ascii="Lato" w:hAnsi="Lato"/>
+          <w:color w:val="000000" w:themeColor="text1"/>
+        </w:rPr>
+        <w:t>Classify Statements</w:t>
       </w:r>
     </w:p>
     <w:tbl>
       <w:tblPr>
         <w:tblW w:w="0" w:type="auto"/>
         <w:tblBorders>
-          <w:top w:val="single" w:sz="4" w:space="0" w:color="auto"/>
-          <w:left w:val="single" w:sz="4" w:space="0" w:color="auto"/>
-          <w:bottom w:val="single" w:sz="4" w:space="0" w:color="auto"/>
-          <w:right w:val="single" w:sz="4" w:space="0" w:color="auto"/>
-          <w:insideH w:val="single" w:sz="4" w:space="0" w:color="auto"/>
-          <w:insideV w:val="single" w:sz="4" w:space="0" w:color="auto"/>
+          <w:top w:val="single" w:sz="4" w:space="0" w:color="ADADAD" w:themeColor="background2" w:themeShade="BF"/>
+          <w:left w:val="single" w:sz="4" w:space="0" w:color="ADADAD" w:themeColor="background2" w:themeShade="BF"/>
+          <w:bottom w:val="single" w:sz="4" w:space="0" w:color="ADADAD" w:themeColor="background2" w:themeShade="BF"/>
+          <w:right w:val="single" w:sz="4" w:space="0" w:color="ADADAD" w:themeColor="background2" w:themeShade="BF"/>
+          <w:insideH w:val="single" w:sz="4" w:space="0" w:color="ADADAD" w:themeColor="background2" w:themeShade="BF"/>
+          <w:insideV w:val="single" w:sz="4" w:space="0" w:color="ADADAD" w:themeColor="background2" w:themeShade="BF"/>
         </w:tblBorders>
         <w:tblCellMar>
           <w:top w:w="15" w:type="dxa"/>
@@ -38,7 +106,7 @@
       </w:tblPr>
       <w:tblGrid>
         <w:gridCol w:w="3681"/>
-        <w:gridCol w:w="1559"/>
+        <w:gridCol w:w="1701"/>
         <w:gridCol w:w="3544"/>
       </w:tblGrid>
       <w:tr>
@@ -66,7 +134,7 @@
         </w:tc>
         <w:tc>
           <w:tcPr>
-            <w:tcW w:w="1559" w:type="dxa"/>
+            <w:tcW w:w="1701" w:type="dxa"/>
             <w:vAlign w:val="center"/>
             <w:hideMark/>
           </w:tcPr>
@@ -117,13 +185,13 @@
           </w:tcPr>
           <w:p>
             <w:r>
-              <w:t>Orders, collection notes, vehicle schedules and delivery outcomes are spread across spreadsheets, messages and paper manifests.</w:t>
-            </w:r>
-          </w:p>
-        </w:tc>
-        <w:tc>
-          <w:tcPr>
-            <w:tcW w:w="1559" w:type="dxa"/>
+              <w:t>Orders, collection notes, vehicle schedules and delivery outcomes are spread across spreadsheets, messages and paper manifests</w:t>
+            </w:r>
+          </w:p>
+        </w:tc>
+        <w:tc>
+          <w:tcPr>
+            <w:tcW w:w="1701" w:type="dxa"/>
             <w:vAlign w:val="center"/>
           </w:tcPr>
           <w:p>
@@ -139,7 +207,7 @@
           </w:tcPr>
           <w:p>
             <w:r>
-              <w:t>Describes the current situation and shows fragmented information.</w:t>
+              <w:t>Describes the current situation and shows fragmented information</w:t>
             </w:r>
           </w:p>
         </w:tc>
@@ -152,13 +220,13 @@
           </w:tcPr>
           <w:p>
             <w:r>
-              <w:t>Changes to quantities, addresses and timing are not always reflected in every copy.</w:t>
-            </w:r>
-          </w:p>
-        </w:tc>
-        <w:tc>
-          <w:tcPr>
-            <w:tcW w:w="1559" w:type="dxa"/>
+              <w:t>Changes to quantities, addresses and timing are not always reflected in every copy</w:t>
+            </w:r>
+          </w:p>
+        </w:tc>
+        <w:tc>
+          <w:tcPr>
+            <w:tcW w:w="1701" w:type="dxa"/>
             <w:vAlign w:val="center"/>
           </w:tcPr>
           <w:p>
@@ -174,7 +242,7 @@
           </w:tcPr>
           <w:p>
             <w:r>
-              <w:t>Shows inconsistent data across copies, which is a current pain point.</w:t>
+              <w:t>Shows inconsistent data across copies, which is a current pain point</w:t>
             </w:r>
           </w:p>
         </w:tc>
@@ -187,13 +255,13 @@
           </w:tcPr>
           <w:p>
             <w:r>
-              <w:t>A printed manifest becomes risky when changes are made after departure (driver).</w:t>
-            </w:r>
-          </w:p>
-        </w:tc>
-        <w:tc>
-          <w:tcPr>
-            <w:tcW w:w="1559" w:type="dxa"/>
+              <w:t>A printed manifest becomes risky when changes are made after departure (driver)</w:t>
+            </w:r>
+          </w:p>
+        </w:tc>
+        <w:tc>
+          <w:tcPr>
+            <w:tcW w:w="1701" w:type="dxa"/>
             <w:vAlign w:val="center"/>
           </w:tcPr>
           <w:p>
@@ -209,7 +277,7 @@
           </w:tcPr>
           <w:p>
             <w:r>
-              <w:t>Stakeholder testimony about the harm caused by outdated route information.</w:t>
+              <w:t>Stakeholder testimony about the harm caused by outdated route information</w:t>
             </w:r>
           </w:p>
         </w:tc>
@@ -222,13 +290,13 @@
           </w:tcPr>
           <w:p>
             <w:r>
-              <w:t>Customers should be told whether a delivery is delayed, transferred or returning another day.</w:t>
-            </w:r>
-          </w:p>
-        </w:tc>
-        <w:tc>
-          <w:tcPr>
-            <w:tcW w:w="1559" w:type="dxa"/>
+              <w:t>Customers should be told whether a delivery is delayed, transferred or returning another day</w:t>
+            </w:r>
+          </w:p>
+        </w:tc>
+        <w:tc>
+          <w:tcPr>
+            <w:tcW w:w="1701" w:type="dxa"/>
             <w:vAlign w:val="center"/>
           </w:tcPr>
           <w:p>
@@ -244,7 +312,7 @@
           </w:tcPr>
           <w:p>
             <w:r>
-              <w:t>Describes a capability the system should provide, based on the customer’s stated need.</w:t>
+              <w:t>Describes a capability the system should provide, based on the customer’s stated need</w:t>
             </w:r>
           </w:p>
         </w:tc>
@@ -257,13 +325,13 @@
           </w:tcPr>
           <w:p>
             <w:r>
-              <w:t>The coordinator needs information on provisional requests, capacity conflicts, late collections, route readiness, failed deliveries and returned goods.</w:t>
-            </w:r>
-          </w:p>
-        </w:tc>
-        <w:tc>
-          <w:tcPr>
-            <w:tcW w:w="1559" w:type="dxa"/>
+              <w:t>The coordinator needs information on provisional requests, capacity conflicts, late collections, route readiness, failed deliveries and returned goods</w:t>
+            </w:r>
+          </w:p>
+        </w:tc>
+        <w:tc>
+          <w:tcPr>
+            <w:tcW w:w="1701" w:type="dxa"/>
             <w:vAlign w:val="center"/>
           </w:tcPr>
           <w:p>
@@ -279,7 +347,7 @@
           </w:tcPr>
           <w:p>
             <w:r>
-              <w:t>Describes reporting capabilities the system should offer.</w:t>
+              <w:t>Describes reporting capabilities the system should offer</w:t>
             </w:r>
           </w:p>
         </w:tc>
@@ -292,13 +360,13 @@
           </w:tcPr>
           <w:p>
             <w:r>
-              <w:t>Drivers record delivery, partial delivery, refusal, damage or failed attempt.</w:t>
-            </w:r>
-          </w:p>
-        </w:tc>
-        <w:tc>
-          <w:tcPr>
-            <w:tcW w:w="1559" w:type="dxa"/>
+              <w:t>Drivers record delivery, partial delivery, refusal, damage or failed attempt</w:t>
+            </w:r>
+          </w:p>
+        </w:tc>
+        <w:tc>
+          <w:tcPr>
+            <w:tcW w:w="1701" w:type="dxa"/>
             <w:vAlign w:val="center"/>
           </w:tcPr>
           <w:p>
@@ -314,7 +382,7 @@
           </w:tcPr>
           <w:p>
             <w:r>
-              <w:t>Describes outcome recording the system needs to support.</w:t>
+              <w:t>Describes outcome recording the system needs to support</w:t>
             </w:r>
           </w:p>
         </w:tc>
@@ -327,13 +395,13 @@
           </w:tcPr>
           <w:p>
             <w:r>
-              <w:t>Before dispatch, staff confirm vehicle, driver, route, load and required documents.</w:t>
-            </w:r>
-          </w:p>
-        </w:tc>
-        <w:tc>
-          <w:tcPr>
-            <w:tcW w:w="1559" w:type="dxa"/>
+              <w:t>Before dispatch, staff confirm vehicle, driver, route, load and required documents</w:t>
+            </w:r>
+          </w:p>
+        </w:tc>
+        <w:tc>
+          <w:tcPr>
+            <w:tcW w:w="1701" w:type="dxa"/>
             <w:vAlign w:val="center"/>
           </w:tcPr>
           <w:p>
@@ -349,7 +417,7 @@
           </w:tcPr>
           <w:p>
             <w:r>
-              <w:t>An operational control that must be applied before a route is dispatched. The exact readiness criteria are still unconfirmed.</w:t>
+              <w:t>An operational control that must be applied before a route is dispatched. The exact readiness criteria are still unconfirmed</w:t>
             </w:r>
           </w:p>
         </w:tc>
@@ -362,13 +430,14 @@
           </w:tcPr>
           <w:p>
             <w:r>
-              <w:t>A vehicle must have suitable capacity, access and temperature capability for the goods it carries.</w:t>
-            </w:r>
-          </w:p>
-        </w:tc>
-        <w:tc>
-          <w:tcPr>
-            <w:tcW w:w="1559" w:type="dxa"/>
+              <w:lastRenderedPageBreak/>
+              <w:t>A vehicle must have suitable capacity, access and temperature capability for the goods it carries</w:t>
+            </w:r>
+          </w:p>
+        </w:tc>
+        <w:tc>
+          <w:tcPr>
+            <w:tcW w:w="1701" w:type="dxa"/>
             <w:vAlign w:val="center"/>
           </w:tcPr>
           <w:p>
@@ -384,7 +453,7 @@
           </w:tcPr>
           <w:p>
             <w:r>
-              <w:t>A domain rule linking goods needs to vehicle capability. The scenario implies it but doesn’t state it as policy.</w:t>
+              <w:t>A domain rule linking goods needs to vehicle capability. The scenario implies it but doesn’t state it as policy</w:t>
             </w:r>
           </w:p>
         </w:tc>
@@ -397,19 +466,334 @@
           </w:tcPr>
           <w:p>
             <w:r>
+              <w:t>At collection or depot receipt, a quantity or condition difference may be accepted, held for clarification or rejected</w:t>
+            </w:r>
+          </w:p>
+        </w:tc>
+        <w:tc>
+          <w:tcPr>
+            <w:tcW w:w="1701" w:type="dxa"/>
+            <w:vAlign w:val="center"/>
+          </w:tcPr>
+          <w:p>
+            <w:r>
+              <w:t>Business Rule</w:t>
+            </w:r>
+          </w:p>
+        </w:tc>
+        <w:tc>
+          <w:tcPr>
+            <w:tcW w:w="3544" w:type="dxa"/>
+            <w:vAlign w:val="center"/>
+          </w:tcPr>
+          <w:p>
+            <w:r>
+              <w:t>Defines the allowed outcomes of a check. Who may decide is unresolved</w:t>
+            </w:r>
+          </w:p>
+        </w:tc>
+      </w:tr>
+      <w:tr>
+        <w:tc>
+          <w:tcPr>
+            <w:tcW w:w="3681" w:type="dxa"/>
+            <w:vAlign w:val="center"/>
+          </w:tcPr>
+          <w:p>
+            <w:r>
+              <w:t>Live vehicle tracking, payments and fleet maintenance are outside scope</w:t>
+            </w:r>
+          </w:p>
+        </w:tc>
+        <w:tc>
+          <w:tcPr>
+            <w:tcW w:w="1701" w:type="dxa"/>
+            <w:vAlign w:val="center"/>
+          </w:tcPr>
+          <w:p>
+            <w:r>
+              <w:t>Constraint</w:t>
+            </w:r>
+          </w:p>
+        </w:tc>
+        <w:tc>
+          <w:tcPr>
+            <w:tcW w:w="3544" w:type="dxa"/>
+            <w:vAlign w:val="center"/>
+          </w:tcPr>
+          <w:p>
+            <w:r>
+              <w:t>Limits what the solution covers</w:t>
+            </w:r>
+          </w:p>
+        </w:tc>
+      </w:tr>
+      <w:tr>
+        <w:tc>
+          <w:tcPr>
+            <w:tcW w:w="3681" w:type="dxa"/>
+            <w:vAlign w:val="center"/>
+          </w:tcPr>
+          <w:p>
+            <w:r>
+              <w:t>Connectivity is unreliable in some rural areas</w:t>
+            </w:r>
+          </w:p>
+        </w:tc>
+        <w:tc>
+          <w:tcPr>
+            <w:tcW w:w="1701" w:type="dxa"/>
+            <w:vAlign w:val="center"/>
+          </w:tcPr>
+          <w:p>
+            <w:r>
+              <w:t>Constraint</w:t>
+            </w:r>
+          </w:p>
+        </w:tc>
+        <w:tc>
+          <w:tcPr>
+            <w:tcW w:w="3544" w:type="dxa"/>
+            <w:vAlign w:val="center"/>
+          </w:tcPr>
+          <w:p>
+            <w:r>
+              <w:t>An environmental limit that restricts how drivers can access information</w:t>
+            </w:r>
+          </w:p>
+        </w:tc>
+      </w:tr>
+      <w:tr>
+        <w:tc>
+          <w:tcPr>
+            <w:tcW w:w="3681" w:type="dxa"/>
+            <w:vAlign w:val="center"/>
+          </w:tcPr>
+          <w:p>
+            <w:r>
+              <w:t>Information supplied by producers is sometimes incomplete until collection</w:t>
+            </w:r>
+          </w:p>
+        </w:tc>
+        <w:tc>
+          <w:tcPr>
+            <w:tcW w:w="1701" w:type="dxa"/>
+            <w:vAlign w:val="center"/>
+          </w:tcPr>
+          <w:p>
+            <w:r>
+              <w:t>Risk</w:t>
+            </w:r>
+          </w:p>
+        </w:tc>
+        <w:tc>
+          <w:tcPr>
+            <w:tcW w:w="3544" w:type="dxa"/>
+            <w:vAlign w:val="center"/>
+          </w:tcPr>
+          <w:p>
+            <w:r>
+              <w:t>Missing goods or handling data may make planning inaccurate</w:t>
+            </w:r>
+          </w:p>
+        </w:tc>
+      </w:tr>
+      <w:tr>
+        <w:tc>
+          <w:tcPr>
+            <w:tcW w:w="3681" w:type="dxa"/>
+            <w:vAlign w:val="center"/>
+          </w:tcPr>
+          <w:p>
+            <w:r>
+              <w:t>Late collection can disrupt several later stops</w:t>
+            </w:r>
+          </w:p>
+        </w:tc>
+        <w:tc>
+          <w:tcPr>
+            <w:tcW w:w="1701" w:type="dxa"/>
+            <w:vAlign w:val="center"/>
+          </w:tcPr>
+          <w:p>
+            <w:r>
+              <w:t>Risk</w:t>
+            </w:r>
+          </w:p>
+        </w:tc>
+        <w:tc>
+          <w:tcPr>
+            <w:tcW w:w="3544" w:type="dxa"/>
+            <w:vAlign w:val="center"/>
+          </w:tcPr>
+          <w:p>
+            <w:r>
+              <w:t>A knock-on delay may affect many deliveries and customers</w:t>
+            </w:r>
+          </w:p>
+        </w:tc>
+      </w:tr>
+      <w:tr>
+        <w:tc>
+          <w:tcPr>
+            <w:tcW w:w="3681" w:type="dxa"/>
+            <w:vAlign w:val="center"/>
+          </w:tcPr>
+          <w:p>
+            <w:r>
+              <w:t>Drivers may keep an outdated printed manifest after a route is republished</w:t>
+            </w:r>
+          </w:p>
+        </w:tc>
+        <w:tc>
+          <w:tcPr>
+            <w:tcW w:w="1701" w:type="dxa"/>
+            <w:vAlign w:val="center"/>
+          </w:tcPr>
+          <w:p>
+            <w:r>
+              <w:t>Risk</w:t>
+            </w:r>
+          </w:p>
+        </w:tc>
+        <w:tc>
+          <w:tcPr>
+            <w:tcW w:w="3544" w:type="dxa"/>
+            <w:vAlign w:val="center"/>
+          </w:tcPr>
+          <w:p>
+            <w:r>
+              <w:t>Uncontrolled route versions may lead to wrong or missed stops</w:t>
+            </w:r>
+          </w:p>
+        </w:tc>
+      </w:tr>
+      <w:tr>
+        <w:tc>
+          <w:tcPr>
+            <w:tcW w:w="3681" w:type="dxa"/>
+            <w:vAlign w:val="center"/>
+          </w:tcPr>
+          <w:p>
+            <w:r>
+              <w:t>Provisional requests may reserve vehicle capacity (staff disagree)</w:t>
+            </w:r>
+          </w:p>
+        </w:tc>
+        <w:tc>
+          <w:tcPr>
+            <w:tcW w:w="1701" w:type="dxa"/>
+            <w:vAlign w:val="center"/>
+          </w:tcPr>
+          <w:p>
+            <w:r>
+              <w:t>Assumption (needs confirmation)</w:t>
+            </w:r>
+          </w:p>
+        </w:tc>
+        <w:tc>
+          <w:tcPr>
+            <w:tcW w:w="3544" w:type="dxa"/>
+            <w:vAlign w:val="center"/>
+          </w:tcPr>
+          <w:p>
+            <w:r>
+              <w:t>The scenario does not settle this, so it must be stated as a temporary assumption and raised as a question</w:t>
+            </w:r>
+          </w:p>
+        </w:tc>
+      </w:tr>
+      <w:tr>
+        <w:tc>
+          <w:tcPr>
+            <w:tcW w:w="3681" w:type="dxa"/>
+            <w:vAlign w:val="center"/>
+          </w:tcPr>
+          <w:p>
+            <w:r>
+              <w:t>The exact quantity may change before collection, but the vehicle still needs enough space (producer)</w:t>
+            </w:r>
+          </w:p>
+        </w:tc>
+        <w:tc>
+          <w:tcPr>
+            <w:tcW w:w="1701" w:type="dxa"/>
+            <w:vAlign w:val="center"/>
+          </w:tcPr>
+          <w:p>
+            <w:r>
+              <w:t>Assumption (needs confirmation)</w:t>
+            </w:r>
+          </w:p>
+        </w:tc>
+        <w:tc>
+          <w:tcPr>
+            <w:tcW w:w="3544" w:type="dxa"/>
+            <w:vAlign w:val="center"/>
+          </w:tcPr>
+          <w:p>
+            <w:r>
+              <w:t>Implies capacity should be planned on an estimate, but the policy isn’t confirmed</w:t>
+            </w:r>
+          </w:p>
+        </w:tc>
+      </w:tr>
+      <w:tr>
+        <w:tc>
+          <w:tcPr>
+            <w:tcW w:w="3681" w:type="dxa"/>
+            <w:vAlign w:val="center"/>
+          </w:tcPr>
+          <w:p>
+            <w:r>
+              <w:t>Drivers may see only the order, producer and customer information they need.</w:t>
+            </w:r>
+          </w:p>
+        </w:tc>
+        <w:tc>
+          <w:tcPr>
+            <w:tcW w:w="1701" w:type="dxa"/>
+            <w:vAlign w:val="center"/>
+          </w:tcPr>
+          <w:p>
+            <w:r>
+              <w:t>Assumption (needs confirmation)</w:t>
+            </w:r>
+          </w:p>
+        </w:tc>
+        <w:tc>
+          <w:tcPr>
+            <w:tcW w:w="3544" w:type="dxa"/>
+            <w:vAlign w:val="center"/>
+          </w:tcPr>
+          <w:p>
+            <w:r>
+              <w:t>The scenario lists driver visibility as unresolved, so any rule is a working assumption</w:t>
+            </w:r>
+          </w:p>
+        </w:tc>
+      </w:tr>
+      <w:tr>
+        <w:tc>
+          <w:tcPr>
+            <w:tcW w:w="3681" w:type="dxa"/>
+            <w:vAlign w:val="center"/>
+          </w:tcPr>
+          <w:p>
+            <w:r>
               <w:lastRenderedPageBreak/>
-              <w:t>At collection or depot receipt, a quantity or condition difference may be accepted, held for clarification or rejected.</w:t>
-            </w:r>
-          </w:p>
-        </w:tc>
-        <w:tc>
-          <w:tcPr>
-            <w:tcW w:w="1559" w:type="dxa"/>
-            <w:vAlign w:val="center"/>
-          </w:tcPr>
-          <w:p>
-            <w:r>
-              <w:t>Business Rule</w:t>
+              <w:t>Routes should be planned around loading and delivery sequence, not just shortest distance (coordinator)</w:t>
+            </w:r>
+          </w:p>
+        </w:tc>
+        <w:tc>
+          <w:tcPr>
+            <w:tcW w:w="1701" w:type="dxa"/>
+            <w:vAlign w:val="center"/>
+          </w:tcPr>
+          <w:p>
+            <w:r>
+              <w:t>Business Rule (candidate)</w:t>
             </w:r>
           </w:p>
         </w:tc>
@@ -420,7 +804,7 @@
           </w:tcPr>
           <w:p>
             <w:r>
-              <w:t>Defines the allowed outcomes of a check. Who may decide is unresolved.</w:t>
+              <w:t>A planning principle from a domain expert. Confirm it is formal policy</w:t>
             </w:r>
           </w:p>
         </w:tc>
@@ -433,18 +817,18 @@
           </w:tcPr>
           <w:p>
             <w:r>
-              <w:t>Live vehicle tracking, payments and fleet maintenance are outside scope.</w:t>
-            </w:r>
-          </w:p>
-        </w:tc>
-        <w:tc>
-          <w:tcPr>
-            <w:tcW w:w="1559" w:type="dxa"/>
-            <w:vAlign w:val="center"/>
-          </w:tcPr>
-          <w:p>
-            <w:r>
-              <w:t>Constraint</w:t>
+              <w:t>“At the depot” does not mean checked and assigned to a route (depot worker)</w:t>
+            </w:r>
+          </w:p>
+        </w:tc>
+        <w:tc>
+          <w:tcPr>
+            <w:tcW w:w="1701" w:type="dxa"/>
+            <w:vAlign w:val="center"/>
+          </w:tcPr>
+          <w:p>
+            <w:r>
+              <w:t>Business Rule (domain distinction)</w:t>
             </w:r>
           </w:p>
         </w:tc>
@@ -455,7 +839,7 @@
           </w:tcPr>
           <w:p>
             <w:r>
-              <w:t>Limits what the solution covers.</w:t>
+              <w:t>Separates depot status from checked and route-assigned status, which affects how goods states are modelled</w:t>
             </w:r>
           </w:p>
         </w:tc>
@@ -468,18 +852,18 @@
           </w:tcPr>
           <w:p>
             <w:r>
-              <w:t>Connectivity is unreliable in some rural areas.</w:t>
-            </w:r>
-          </w:p>
-        </w:tc>
-        <w:tc>
-          <w:tcPr>
-            <w:tcW w:w="1559" w:type="dxa"/>
-            <w:vAlign w:val="center"/>
-          </w:tcPr>
-          <w:p>
-            <w:r>
-              <w:t>Constraint</w:t>
+              <w:t>The system should use a mobile app with offline manifests</w:t>
+            </w:r>
+          </w:p>
+        </w:tc>
+        <w:tc>
+          <w:tcPr>
+            <w:tcW w:w="1701" w:type="dxa"/>
+            <w:vAlign w:val="center"/>
+          </w:tcPr>
+          <w:p>
+            <w:r>
+              <w:t>Solution Idea</w:t>
             </w:r>
           </w:p>
         </w:tc>
@@ -490,329 +874,2460 @@
           </w:tcPr>
           <w:p>
             <w:r>
-              <w:t>An environmental limit that restricts how drivers can access information.</w:t>
-            </w:r>
-          </w:p>
-        </w:tc>
-      </w:tr>
-      <w:tr>
-        <w:tc>
-          <w:tcPr>
-            <w:tcW w:w="3681" w:type="dxa"/>
-            <w:vAlign w:val="center"/>
-          </w:tcPr>
-          <w:p>
-            <w:r>
-              <w:t>Information supplied by producers is sometimes incomplete until collection.</w:t>
-            </w:r>
-          </w:p>
-        </w:tc>
-        <w:tc>
-          <w:tcPr>
-            <w:tcW w:w="1559" w:type="dxa"/>
-            <w:vAlign w:val="center"/>
-          </w:tcPr>
-          <w:p>
-            <w:r>
-              <w:t>Risk</w:t>
-            </w:r>
-          </w:p>
-        </w:tc>
-        <w:tc>
-          <w:tcPr>
-            <w:tcW w:w="3544" w:type="dxa"/>
-            <w:vAlign w:val="center"/>
-          </w:tcPr>
-          <w:p>
-            <w:r>
-              <w:t>Missing goods or handling data may make planning inaccurate.</w:t>
-            </w:r>
-          </w:p>
-        </w:tc>
-      </w:tr>
-      <w:tr>
-        <w:tc>
-          <w:tcPr>
-            <w:tcW w:w="3681" w:type="dxa"/>
-            <w:vAlign w:val="center"/>
-          </w:tcPr>
-          <w:p>
-            <w:r>
-              <w:t>Late collection can disrupt several later stops.</w:t>
-            </w:r>
-          </w:p>
-        </w:tc>
-        <w:tc>
-          <w:tcPr>
-            <w:tcW w:w="1559" w:type="dxa"/>
-            <w:vAlign w:val="center"/>
-          </w:tcPr>
-          <w:p>
-            <w:r>
-              <w:t>Risk</w:t>
-            </w:r>
-          </w:p>
-        </w:tc>
-        <w:tc>
-          <w:tcPr>
-            <w:tcW w:w="3544" w:type="dxa"/>
-            <w:vAlign w:val="center"/>
-          </w:tcPr>
-          <w:p>
-            <w:r>
-              <w:t>A knock-on delay may affect many deliveries and customers.</w:t>
-            </w:r>
-          </w:p>
-        </w:tc>
-      </w:tr>
-      <w:tr>
-        <w:tc>
-          <w:tcPr>
-            <w:tcW w:w="3681" w:type="dxa"/>
-            <w:vAlign w:val="center"/>
-          </w:tcPr>
-          <w:p>
-            <w:r>
-              <w:t>Drivers may keep an outdated printed manifest after a route is republished.</w:t>
-            </w:r>
-          </w:p>
-        </w:tc>
-        <w:tc>
-          <w:tcPr>
-            <w:tcW w:w="1559" w:type="dxa"/>
-            <w:vAlign w:val="center"/>
-          </w:tcPr>
-          <w:p>
-            <w:r>
-              <w:t>Risk</w:t>
-            </w:r>
-          </w:p>
-        </w:tc>
-        <w:tc>
-          <w:tcPr>
-            <w:tcW w:w="3544" w:type="dxa"/>
-            <w:vAlign w:val="center"/>
-          </w:tcPr>
-          <w:p>
-            <w:r>
-              <w:t>Uncontrolled route versions may lead to wrong or missed stops.</w:t>
-            </w:r>
-          </w:p>
-        </w:tc>
-      </w:tr>
-      <w:tr>
-        <w:tc>
-          <w:tcPr>
-            <w:tcW w:w="3681" w:type="dxa"/>
-            <w:vAlign w:val="center"/>
-          </w:tcPr>
-          <w:p>
-            <w:r>
-              <w:t>Provisional requests may reserve vehicle capacity (staff disagree).</w:t>
-            </w:r>
-          </w:p>
-        </w:tc>
-        <w:tc>
-          <w:tcPr>
-            <w:tcW w:w="1559" w:type="dxa"/>
-            <w:vAlign w:val="center"/>
-          </w:tcPr>
-          <w:p>
-            <w:r>
-              <w:t>Assumption (needs confirmation)</w:t>
-            </w:r>
-          </w:p>
-        </w:tc>
-        <w:tc>
-          <w:tcPr>
-            <w:tcW w:w="3544" w:type="dxa"/>
-            <w:vAlign w:val="center"/>
-          </w:tcPr>
-          <w:p>
-            <w:r>
-              <w:t>The scenario does not settle this, so it must be stated as a temporary assumption and raised as a question.</w:t>
-            </w:r>
-          </w:p>
-        </w:tc>
-      </w:tr>
-      <w:tr>
-        <w:tc>
-          <w:tcPr>
-            <w:tcW w:w="3681" w:type="dxa"/>
-            <w:vAlign w:val="center"/>
-          </w:tcPr>
-          <w:p>
-            <w:r>
-              <w:t>The exact quantity may change before collection, but the vehicle still needs enough space (producer).</w:t>
-            </w:r>
-          </w:p>
-        </w:tc>
-        <w:tc>
-          <w:tcPr>
-            <w:tcW w:w="1559" w:type="dxa"/>
-            <w:vAlign w:val="center"/>
-          </w:tcPr>
-          <w:p>
-            <w:r>
-              <w:t>Assumption (needs confirmation)</w:t>
-            </w:r>
-          </w:p>
-        </w:tc>
-        <w:tc>
-          <w:tcPr>
-            <w:tcW w:w="3544" w:type="dxa"/>
-            <w:vAlign w:val="center"/>
-          </w:tcPr>
-          <w:p>
-            <w:r>
-              <w:t>Implies capacity should be planned on an estimate, but the policy isn’t confirmed.</w:t>
-            </w:r>
-          </w:p>
-        </w:tc>
-      </w:tr>
-      <w:tr>
-        <w:tc>
-          <w:tcPr>
-            <w:tcW w:w="3681" w:type="dxa"/>
-            <w:vAlign w:val="center"/>
-          </w:tcPr>
-          <w:p>
-            <w:r>
-              <w:t>Drivers may see only the order, producer and customer information they need.</w:t>
-            </w:r>
-          </w:p>
-        </w:tc>
-        <w:tc>
-          <w:tcPr>
-            <w:tcW w:w="1559" w:type="dxa"/>
-            <w:vAlign w:val="center"/>
-          </w:tcPr>
-          <w:p>
-            <w:r>
-              <w:t>Assumption (needs confirmation)</w:t>
-            </w:r>
-          </w:p>
-        </w:tc>
-        <w:tc>
-          <w:tcPr>
-            <w:tcW w:w="3544" w:type="dxa"/>
-            <w:vAlign w:val="center"/>
-          </w:tcPr>
-          <w:p>
-            <w:r>
-              <w:t>The scenario lists driver visibility as unresolved, so any rule is a working assumption.</w:t>
-            </w:r>
-          </w:p>
-        </w:tc>
-      </w:tr>
-      <w:tr>
-        <w:tc>
-          <w:tcPr>
-            <w:tcW w:w="3681" w:type="dxa"/>
-            <w:vAlign w:val="center"/>
-          </w:tcPr>
-          <w:p>
-            <w:r>
-              <w:t>Routes should be planned around loading and delivery sequence, not just shortest distance (coordinator).</w:t>
-            </w:r>
-          </w:p>
-        </w:tc>
-        <w:tc>
-          <w:tcPr>
-            <w:tcW w:w="1559" w:type="dxa"/>
-            <w:vAlign w:val="center"/>
-          </w:tcPr>
-          <w:p>
-            <w:r>
-              <w:t>Business Rule (candidate)</w:t>
-            </w:r>
-          </w:p>
-        </w:tc>
-        <w:tc>
-          <w:tcPr>
-            <w:tcW w:w="3544" w:type="dxa"/>
-            <w:vAlign w:val="center"/>
-          </w:tcPr>
-          <w:p>
-            <w:r>
-              <w:t>A planning principle from a domain expert. Confirm it is formal policy.</w:t>
-            </w:r>
-          </w:p>
-        </w:tc>
-      </w:tr>
-      <w:tr>
-        <w:tc>
-          <w:tcPr>
-            <w:tcW w:w="3681" w:type="dxa"/>
-            <w:vAlign w:val="center"/>
-          </w:tcPr>
-          <w:p>
-            <w:r>
-              <w:lastRenderedPageBreak/>
-              <w:t>“At the depot” does not mean checked and assigned to a route (depot worker).</w:t>
-            </w:r>
-          </w:p>
-        </w:tc>
-        <w:tc>
-          <w:tcPr>
-            <w:tcW w:w="1559" w:type="dxa"/>
-            <w:vAlign w:val="center"/>
-          </w:tcPr>
-          <w:p>
-            <w:r>
-              <w:t>Business Rule (domain distinction)</w:t>
-            </w:r>
-          </w:p>
-        </w:tc>
-        <w:tc>
-          <w:tcPr>
-            <w:tcW w:w="3544" w:type="dxa"/>
-            <w:vAlign w:val="center"/>
-          </w:tcPr>
-          <w:p>
-            <w:r>
-              <w:t>Separates depot status from checked and route-assigned status, which affects how goods states are modelled.</w:t>
-            </w:r>
-          </w:p>
-        </w:tc>
-      </w:tr>
-      <w:tr>
-        <w:tc>
-          <w:tcPr>
-            <w:tcW w:w="3681" w:type="dxa"/>
-            <w:vAlign w:val="center"/>
-          </w:tcPr>
-          <w:p>
-            <w:r>
-              <w:t>The system should use a mobile app with offline manifests.</w:t>
-            </w:r>
-          </w:p>
-        </w:tc>
-        <w:tc>
-          <w:tcPr>
-            <w:tcW w:w="1559" w:type="dxa"/>
-            <w:vAlign w:val="center"/>
-          </w:tcPr>
-          <w:p>
-            <w:r>
-              <w:t>Solution Idea</w:t>
-            </w:r>
-          </w:p>
-        </w:tc>
-        <w:tc>
-          <w:tcPr>
-            <w:tcW w:w="3544" w:type="dxa"/>
-            <w:vAlign w:val="center"/>
-          </w:tcPr>
-          <w:p>
-            <w:r>
-              <w:t>Prescribes a technical design rather than stating a business need.</w:t>
+              <w:t>Prescribes a technical design rather than stating a business need</w:t>
             </w:r>
           </w:p>
         </w:tc>
       </w:tr>
     </w:tbl>
     <w:p/>
+    <w:p/>
+    <w:p>
+      <w:pPr>
+        <w:pStyle w:val="Heading1"/>
+        <w:shd w:val="clear" w:color="auto" w:fill="FFFFFF"/>
+        <w:spacing w:before="90" w:after="90"/>
+        <w:rPr>
+          <w:rFonts w:ascii="Lato" w:hAnsi="Lato"/>
+          <w:color w:val="000000" w:themeColor="text1"/>
+        </w:rPr>
+      </w:pPr>
+      <w:r>
+        <w:rPr>
+          <w:rFonts w:ascii="Lato" w:hAnsi="Lato"/>
+          <w:color w:val="000000" w:themeColor="text1"/>
+        </w:rPr>
+        <w:t>Task 2: Business Problem Statement</w:t>
+      </w:r>
+    </w:p>
+    <w:p>
+      <w:pPr>
+        <w:spacing w:line="276" w:lineRule="auto"/>
+      </w:pPr>
+      <w:r>
+        <w:t>Kerry Regional Distribution Network coordinates deliveries for small producers and retailers, collecting goods from suppliers, consolidating them at a depot and delivering them to customers. Orders, collection notes, vehicle schedules and delivery outcomes are currently spread across spreadsheets, messages and paper manifests, and changes to quantities, addresses and timing are not always reflected in every copy.</w:t>
+      </w:r>
+    </w:p>
+    <w:p>
+      <w:pPr>
+        <w:spacing w:line="276" w:lineRule="auto"/>
+      </w:pPr>
+      <w:r>
+        <w:t xml:space="preserve">As a </w:t>
+      </w:r>
+      <w:r>
+        <w:t>result,</w:t>
+      </w:r>
+      <w:r>
+        <w:t xml:space="preserve"> staff cannot </w:t>
+      </w:r>
+      <w:r>
+        <w:t>clearly</w:t>
+      </w:r>
+      <w:r>
+        <w:t xml:space="preserve"> plan vehicle capacity, match available vehicles with suitable drivers or tell whether a route is ready for dispatch. Drivers using printed manifests may keep outdated routes after changes, and goods at the depot are not clearly distinguished from goods that have been checked and assigned. When collections run late or deliveries fail, customers and producers do not receive consistent status information, and the coordinator cannot easily see capacity conflicts, failed deliveries or returned goods.</w:t>
+      </w:r>
+    </w:p>
+    <w:p>
+      <w:pPr>
+        <w:spacing w:line="276" w:lineRule="auto"/>
+      </w:pPr>
+      <w:r>
+        <w:t>These problems increase coordination effort, reduce confidence in operational information and raise the risk of delayed or incorrect deliveries. Several policies remain unconfirmed, such as when provisional requests reserve capacity and how route versions are controlled so these are treated as assumptions or questions for stakeholders. Live vehicle tracking, payments and fleet maintenance are out of scope</w:t>
+      </w:r>
+    </w:p>
+    <w:p>
+      <w:pPr>
+        <w:spacing w:line="276" w:lineRule="auto"/>
+      </w:pPr>
+    </w:p>
+    <w:p>
+      <w:pPr>
+        <w:spacing w:line="276" w:lineRule="auto"/>
+      </w:pPr>
+    </w:p>
+    <w:p/>
+    <w:p>
+      <w:pPr>
+        <w:pStyle w:val="Heading1"/>
+        <w:shd w:val="clear" w:color="auto" w:fill="FFFFFF"/>
+        <w:spacing w:before="90" w:after="90"/>
+        <w:rPr>
+          <w:rFonts w:ascii="Lato" w:hAnsi="Lato"/>
+          <w:color w:val="000000" w:themeColor="text1"/>
+        </w:rPr>
+      </w:pPr>
+      <w:r>
+        <w:rPr>
+          <w:rFonts w:ascii="Lato" w:hAnsi="Lato"/>
+          <w:color w:val="000000" w:themeColor="text1"/>
+        </w:rPr>
+        <w:lastRenderedPageBreak/>
+        <w:t xml:space="preserve">Task </w:t>
+      </w:r>
+      <w:r>
+        <w:rPr>
+          <w:rFonts w:ascii="Lato" w:hAnsi="Lato"/>
+          <w:color w:val="000000" w:themeColor="text1"/>
+        </w:rPr>
+        <w:t>3</w:t>
+      </w:r>
+      <w:r>
+        <w:rPr>
+          <w:rFonts w:ascii="Lato" w:hAnsi="Lato"/>
+          <w:color w:val="000000" w:themeColor="text1"/>
+        </w:rPr>
+        <w:t xml:space="preserve">: </w:t>
+      </w:r>
+      <w:r>
+        <w:rPr>
+          <w:rFonts w:ascii="Lato" w:hAnsi="Lato"/>
+          <w:color w:val="000000" w:themeColor="text1"/>
+        </w:rPr>
+        <w:t>Purpose and Scope</w:t>
+      </w:r>
+    </w:p>
+    <w:p>
+      <w:pPr>
+        <w:rPr>
+          <w:b/>
+          <w:bCs/>
+          <w:sz w:val="36"/>
+          <w:szCs w:val="36"/>
+        </w:rPr>
+      </w:pPr>
+      <w:r>
+        <w:rPr>
+          <w:b/>
+          <w:bCs/>
+          <w:sz w:val="36"/>
+          <w:szCs w:val="36"/>
+        </w:rPr>
+        <w:t>Purpose Statement</w:t>
+      </w:r>
+    </w:p>
+    <w:p>
+      <w:r>
+        <w:t>The proposed Regional Delivery Coordination Service will support delivery request management, consignment handling, vehicle and driver planning, depot receipt and checking, dispatch readiness, delivery outcome recording, disruption and status communication, and operational reporting.</w:t>
+      </w:r>
+    </w:p>
+    <w:p>
+      <w:pPr>
+        <w:rPr>
+          <w:b/>
+          <w:bCs/>
+          <w:sz w:val="36"/>
+          <w:szCs w:val="36"/>
+        </w:rPr>
+      </w:pPr>
+      <w:r>
+        <w:rPr>
+          <w:b/>
+          <w:bCs/>
+          <w:sz w:val="36"/>
+          <w:szCs w:val="36"/>
+        </w:rPr>
+        <w:t>Scope Definition</w:t>
+      </w:r>
+    </w:p>
+    <w:tbl>
+      <w:tblPr>
+        <w:tblStyle w:val="TableGrid"/>
+        <w:tblW w:w="0" w:type="auto"/>
+        <w:tblLook w:val="04A0" w:firstRow="1" w:lastRow="0" w:firstColumn="1" w:lastColumn="0" w:noHBand="0" w:noVBand="1"/>
+      </w:tblPr>
+      <w:tblGrid>
+        <w:gridCol w:w="4248"/>
+        <w:gridCol w:w="3685"/>
+      </w:tblGrid>
+      <w:tr>
+        <w:trPr>
+          <w:trHeight w:val="554"/>
+        </w:trPr>
+        <w:tc>
+          <w:tcPr>
+            <w:tcW w:w="4248" w:type="dxa"/>
+            <w:vAlign w:val="center"/>
+          </w:tcPr>
+          <w:p>
+            <w:r>
+              <w:rPr>
+                <w:b/>
+                <w:bCs/>
+              </w:rPr>
+              <w:t>In Scope</w:t>
+            </w:r>
+          </w:p>
+        </w:tc>
+        <w:tc>
+          <w:tcPr>
+            <w:tcW w:w="3685" w:type="dxa"/>
+            <w:vAlign w:val="center"/>
+          </w:tcPr>
+          <w:p>
+            <w:r>
+              <w:rPr>
+                <w:b/>
+                <w:bCs/>
+              </w:rPr>
+              <w:t>Out of Scope for Initial Release</w:t>
+            </w:r>
+          </w:p>
+        </w:tc>
+      </w:tr>
+      <w:tr>
+        <w:trPr>
+          <w:trHeight w:val="832"/>
+        </w:trPr>
+        <w:tc>
+          <w:tcPr>
+            <w:tcW w:w="4248" w:type="dxa"/>
+            <w:vAlign w:val="center"/>
+          </w:tcPr>
+          <w:p>
+            <w:r>
+              <w:t>Delivery requests</w:t>
+            </w:r>
+          </w:p>
+        </w:tc>
+        <w:tc>
+          <w:tcPr>
+            <w:tcW w:w="3685" w:type="dxa"/>
+            <w:vAlign w:val="center"/>
+          </w:tcPr>
+          <w:p>
+            <w:r>
+              <w:t>Live vehicle tracking</w:t>
+            </w:r>
+          </w:p>
+        </w:tc>
+      </w:tr>
+      <w:tr>
+        <w:trPr>
+          <w:trHeight w:val="702"/>
+        </w:trPr>
+        <w:tc>
+          <w:tcPr>
+            <w:tcW w:w="4248" w:type="dxa"/>
+            <w:vAlign w:val="center"/>
+          </w:tcPr>
+          <w:p>
+            <w:r>
+              <w:t>Consignments and goods information</w:t>
+            </w:r>
+          </w:p>
+        </w:tc>
+        <w:tc>
+          <w:tcPr>
+            <w:tcW w:w="3685" w:type="dxa"/>
+            <w:vAlign w:val="center"/>
+          </w:tcPr>
+          <w:p>
+            <w:r>
+              <w:t>Payments</w:t>
+            </w:r>
+          </w:p>
+        </w:tc>
+      </w:tr>
+      <w:tr>
+        <w:trPr>
+          <w:trHeight w:val="996"/>
+        </w:trPr>
+        <w:tc>
+          <w:tcPr>
+            <w:tcW w:w="4248" w:type="dxa"/>
+            <w:vAlign w:val="center"/>
+          </w:tcPr>
+          <w:p>
+            <w:r>
+              <w:t>Vehicle and driver availability and suitability</w:t>
+            </w:r>
+          </w:p>
+        </w:tc>
+        <w:tc>
+          <w:tcPr>
+            <w:tcW w:w="3685" w:type="dxa"/>
+            <w:vAlign w:val="center"/>
+          </w:tcPr>
+          <w:p>
+            <w:r>
+              <w:t>Fleet maintenance</w:t>
+            </w:r>
+          </w:p>
+        </w:tc>
+      </w:tr>
+      <w:tr>
+        <w:trPr>
+          <w:trHeight w:val="996"/>
+        </w:trPr>
+        <w:tc>
+          <w:tcPr>
+            <w:tcW w:w="4248" w:type="dxa"/>
+            <w:vAlign w:val="center"/>
+          </w:tcPr>
+          <w:p>
+            <w:r>
+              <w:t>Depot receipt, checking and load assignment</w:t>
+            </w:r>
+          </w:p>
+        </w:tc>
+        <w:tc>
+          <w:tcPr>
+            <w:tcW w:w="3685" w:type="dxa"/>
+            <w:vAlign w:val="center"/>
+          </w:tcPr>
+          <w:p>
+            <w:r>
+              <w:t>Customer ordering website</w:t>
+            </w:r>
+          </w:p>
+        </w:tc>
+      </w:tr>
+      <w:tr>
+        <w:trPr>
+          <w:trHeight w:val="996"/>
+        </w:trPr>
+        <w:tc>
+          <w:tcPr>
+            <w:tcW w:w="4248" w:type="dxa"/>
+            <w:vAlign w:val="center"/>
+          </w:tcPr>
+          <w:p>
+            <w:r>
+              <w:t>Dispatch readiness checks</w:t>
+            </w:r>
+          </w:p>
+        </w:tc>
+        <w:tc>
+          <w:tcPr>
+            <w:tcW w:w="3685" w:type="dxa"/>
+            <w:vAlign w:val="center"/>
+          </w:tcPr>
+          <w:p>
+            <w:r>
+              <w:t>Mobile application</w:t>
+            </w:r>
+          </w:p>
+        </w:tc>
+      </w:tr>
+    </w:tbl>
+    <w:p/>
+    <w:p/>
+    <w:p/>
+    <w:p>
+      <w:pPr>
+        <w:pStyle w:val="Heading1"/>
+        <w:shd w:val="clear" w:color="auto" w:fill="FFFFFF"/>
+        <w:spacing w:before="90" w:after="90"/>
+        <w:rPr>
+          <w:rFonts w:ascii="Lato" w:hAnsi="Lato"/>
+          <w:color w:val="000000" w:themeColor="text1"/>
+        </w:rPr>
+      </w:pPr>
+      <w:r>
+        <w:rPr>
+          <w:rFonts w:ascii="Lato" w:hAnsi="Lato"/>
+          <w:color w:val="000000" w:themeColor="text1"/>
+        </w:rPr>
+        <w:t xml:space="preserve">Task </w:t>
+      </w:r>
+      <w:r>
+        <w:rPr>
+          <w:rFonts w:ascii="Lato" w:hAnsi="Lato"/>
+          <w:color w:val="000000" w:themeColor="text1"/>
+        </w:rPr>
+        <w:t>4</w:t>
+      </w:r>
+      <w:r>
+        <w:rPr>
+          <w:rFonts w:ascii="Lato" w:hAnsi="Lato"/>
+          <w:color w:val="000000" w:themeColor="text1"/>
+        </w:rPr>
+        <w:t xml:space="preserve">: </w:t>
+      </w:r>
+      <w:r>
+        <w:rPr>
+          <w:rFonts w:ascii="Lato" w:hAnsi="Lato"/>
+          <w:color w:val="000000" w:themeColor="text1"/>
+        </w:rPr>
+        <w:t>Stakeholder Analysis</w:t>
+      </w:r>
+    </w:p>
+    <w:tbl>
+      <w:tblPr>
+        <w:tblStyle w:val="TableGrid"/>
+        <w:tblW w:w="9924" w:type="dxa"/>
+        <w:tblInd w:w="-431" w:type="dxa"/>
+        <w:tblLook w:val="04A0" w:firstRow="1" w:lastRow="0" w:firstColumn="1" w:lastColumn="0" w:noHBand="0" w:noVBand="1"/>
+      </w:tblPr>
+      <w:tblGrid>
+        <w:gridCol w:w="1844"/>
+        <w:gridCol w:w="1984"/>
+        <w:gridCol w:w="2410"/>
+        <w:gridCol w:w="1405"/>
+        <w:gridCol w:w="2281"/>
+      </w:tblGrid>
+      <w:tr>
+        <w:tc>
+          <w:tcPr>
+            <w:tcW w:w="1844" w:type="dxa"/>
+            <w:vAlign w:val="center"/>
+          </w:tcPr>
+          <w:p>
+            <w:r>
+              <w:rPr>
+                <w:b/>
+                <w:bCs/>
+              </w:rPr>
+              <w:t>Stakeholder</w:t>
+            </w:r>
+          </w:p>
+        </w:tc>
+        <w:tc>
+          <w:tcPr>
+            <w:tcW w:w="1984" w:type="dxa"/>
+            <w:vAlign w:val="center"/>
+          </w:tcPr>
+          <w:p>
+            <w:r>
+              <w:rPr>
+                <w:b/>
+                <w:bCs/>
+              </w:rPr>
+              <w:t>Goals</w:t>
+            </w:r>
+          </w:p>
+        </w:tc>
+        <w:tc>
+          <w:tcPr>
+            <w:tcW w:w="2410" w:type="dxa"/>
+            <w:vAlign w:val="center"/>
+          </w:tcPr>
+          <w:p>
+            <w:r>
+              <w:rPr>
+                <w:b/>
+                <w:bCs/>
+              </w:rPr>
+              <w:t>Concerns</w:t>
+            </w:r>
+          </w:p>
+        </w:tc>
+        <w:tc>
+          <w:tcPr>
+            <w:tcW w:w="1405" w:type="dxa"/>
+            <w:vAlign w:val="center"/>
+          </w:tcPr>
+          <w:p>
+            <w:r>
+              <w:rPr>
+                <w:b/>
+                <w:bCs/>
+              </w:rPr>
+              <w:t>Influence</w:t>
+            </w:r>
+          </w:p>
+        </w:tc>
+        <w:tc>
+          <w:tcPr>
+            <w:tcW w:w="2281" w:type="dxa"/>
+            <w:vAlign w:val="center"/>
+          </w:tcPr>
+          <w:p>
+            <w:r>
+              <w:rPr>
+                <w:b/>
+                <w:bCs/>
+              </w:rPr>
+              <w:t>Expected Interaction</w:t>
+            </w:r>
+          </w:p>
+        </w:tc>
+      </w:tr>
+      <w:tr>
+        <w:tc>
+          <w:tcPr>
+            <w:tcW w:w="1844" w:type="dxa"/>
+            <w:vAlign w:val="center"/>
+          </w:tcPr>
+          <w:p>
+            <w:r>
+              <w:t>Coordinator</w:t>
+            </w:r>
+          </w:p>
+        </w:tc>
+        <w:tc>
+          <w:tcPr>
+            <w:tcW w:w="1984" w:type="dxa"/>
+            <w:vAlign w:val="center"/>
+          </w:tcPr>
+          <w:p>
+            <w:r>
+              <w:t>Plan workable loading and delivery sequences and monitor operations</w:t>
+            </w:r>
+          </w:p>
+        </w:tc>
+        <w:tc>
+          <w:tcPr>
+            <w:tcW w:w="2410" w:type="dxa"/>
+            <w:vAlign w:val="center"/>
+          </w:tcPr>
+          <w:p>
+            <w:r>
+              <w:t>Shortest route not always workable; capacity conflicts, late collections, route readiness, failed deliveries</w:t>
+            </w:r>
+          </w:p>
+        </w:tc>
+        <w:tc>
+          <w:tcPr>
+            <w:tcW w:w="1405" w:type="dxa"/>
+            <w:vAlign w:val="center"/>
+          </w:tcPr>
+          <w:p>
+            <w:r>
+              <w:t>High</w:t>
+            </w:r>
+          </w:p>
+        </w:tc>
+        <w:tc>
+          <w:tcPr>
+            <w:tcW w:w="2281" w:type="dxa"/>
+            <w:vAlign w:val="center"/>
+          </w:tcPr>
+          <w:p>
+            <w:r>
+              <w:t>Plan and re</w:t>
+            </w:r>
+            <w:r>
+              <w:t xml:space="preserve">arrange </w:t>
+            </w:r>
+            <w:r>
+              <w:t>routes, review capacity conflicts and route readiness, monitor failed deliveries and returned goods</w:t>
+            </w:r>
+          </w:p>
+        </w:tc>
+      </w:tr>
+      <w:tr>
+        <w:tc>
+          <w:tcPr>
+            <w:tcW w:w="1844" w:type="dxa"/>
+            <w:vAlign w:val="center"/>
+          </w:tcPr>
+          <w:p>
+            <w:r>
+              <w:lastRenderedPageBreak/>
+              <w:t>Drivers</w:t>
+            </w:r>
+          </w:p>
+        </w:tc>
+        <w:tc>
+          <w:tcPr>
+            <w:tcW w:w="1984" w:type="dxa"/>
+            <w:vAlign w:val="center"/>
+          </w:tcPr>
+          <w:p>
+            <w:r>
+              <w:t>Follow accurate, current routes and record delivery outcomes</w:t>
+            </w:r>
+          </w:p>
+        </w:tc>
+        <w:tc>
+          <w:tcPr>
+            <w:tcW w:w="2410" w:type="dxa"/>
+            <w:vAlign w:val="center"/>
+          </w:tcPr>
+          <w:p>
+            <w:r>
+              <w:t>Outdated printed manifests after changes</w:t>
+            </w:r>
+          </w:p>
+        </w:tc>
+        <w:tc>
+          <w:tcPr>
+            <w:tcW w:w="1405" w:type="dxa"/>
+            <w:vAlign w:val="center"/>
+          </w:tcPr>
+          <w:p>
+            <w:r>
+              <w:t>Medium</w:t>
+            </w:r>
+          </w:p>
+        </w:tc>
+        <w:tc>
+          <w:tcPr>
+            <w:tcW w:w="2281" w:type="dxa"/>
+            <w:vAlign w:val="center"/>
+          </w:tcPr>
+          <w:p>
+            <w:r>
+              <w:t>View routes and manifests, record delivery, partial delivery, refusal, damage or failed attempt</w:t>
+            </w:r>
+          </w:p>
+        </w:tc>
+      </w:tr>
+      <w:tr>
+        <w:tc>
+          <w:tcPr>
+            <w:tcW w:w="1844" w:type="dxa"/>
+            <w:vAlign w:val="center"/>
+          </w:tcPr>
+          <w:p>
+            <w:r>
+              <w:t>Producers</w:t>
+            </w:r>
+          </w:p>
+        </w:tc>
+        <w:tc>
+          <w:tcPr>
+            <w:tcW w:w="1984" w:type="dxa"/>
+            <w:vAlign w:val="center"/>
+          </w:tcPr>
+          <w:p>
+            <w:r>
+              <w:t>Have goods collected with enough vehicle space</w:t>
+            </w:r>
+          </w:p>
+        </w:tc>
+        <w:tc>
+          <w:tcPr>
+            <w:tcW w:w="2410" w:type="dxa"/>
+            <w:vAlign w:val="center"/>
+          </w:tcPr>
+          <w:p>
+            <w:r>
+              <w:t>Quantity may change before collection; incomplete goods information; status updates</w:t>
+            </w:r>
+          </w:p>
+        </w:tc>
+        <w:tc>
+          <w:tcPr>
+            <w:tcW w:w="1405" w:type="dxa"/>
+            <w:vAlign w:val="center"/>
+          </w:tcPr>
+          <w:p>
+            <w:r>
+              <w:t>Medium</w:t>
+            </w:r>
+          </w:p>
+        </w:tc>
+        <w:tc>
+          <w:tcPr>
+            <w:tcW w:w="2281" w:type="dxa"/>
+            <w:vAlign w:val="center"/>
+          </w:tcPr>
+          <w:p>
+            <w:r>
+              <w:t>Supply goods information, receive collection and status information, give instructions for returned goods</w:t>
+            </w:r>
+          </w:p>
+        </w:tc>
+      </w:tr>
+      <w:tr>
+        <w:tc>
+          <w:tcPr>
+            <w:tcW w:w="1844" w:type="dxa"/>
+            <w:vAlign w:val="center"/>
+          </w:tcPr>
+          <w:p>
+            <w:r>
+              <w:t>Depot Workers</w:t>
+            </w:r>
+          </w:p>
+        </w:tc>
+        <w:tc>
+          <w:tcPr>
+            <w:tcW w:w="1984" w:type="dxa"/>
+            <w:vAlign w:val="center"/>
+          </w:tcPr>
+          <w:p>
+            <w:r>
+              <w:t>Check goods accurately and assign them to routes and loading positions</w:t>
+            </w:r>
+          </w:p>
+        </w:tc>
+        <w:tc>
+          <w:tcPr>
+            <w:tcW w:w="2410" w:type="dxa"/>
+            <w:vAlign w:val="center"/>
+          </w:tcPr>
+          <w:p>
+            <w:r>
+              <w:t>“At the depot” is not the same as checked and assigned</w:t>
+            </w:r>
+          </w:p>
+        </w:tc>
+        <w:tc>
+          <w:tcPr>
+            <w:tcW w:w="1405" w:type="dxa"/>
+            <w:vAlign w:val="center"/>
+          </w:tcPr>
+          <w:p>
+            <w:r>
+              <w:t>Medium</w:t>
+            </w:r>
+          </w:p>
+        </w:tc>
+        <w:tc>
+          <w:tcPr>
+            <w:tcW w:w="2281" w:type="dxa"/>
+            <w:vAlign w:val="center"/>
+          </w:tcPr>
+          <w:p>
+            <w:r>
+              <w:t>Confirm consignment, quantity, condition and labels; accept, hold or reject differences; assign goods to routes</w:t>
+            </w:r>
+          </w:p>
+        </w:tc>
+      </w:tr>
+      <w:tr>
+        <w:tc>
+          <w:tcPr>
+            <w:tcW w:w="1844" w:type="dxa"/>
+            <w:vAlign w:val="center"/>
+          </w:tcPr>
+          <w:p>
+            <w:r>
+              <w:t>Customers</w:t>
+            </w:r>
+          </w:p>
+        </w:tc>
+        <w:tc>
+          <w:tcPr>
+            <w:tcW w:w="1984" w:type="dxa"/>
+            <w:vAlign w:val="center"/>
+          </w:tcPr>
+          <w:p>
+            <w:r>
+              <w:t>Know the status of their delivery</w:t>
+            </w:r>
+          </w:p>
+        </w:tc>
+        <w:tc>
+          <w:tcPr>
+            <w:tcW w:w="2410" w:type="dxa"/>
+            <w:vAlign w:val="center"/>
+          </w:tcPr>
+          <w:p>
+            <w:r>
+              <w:t>Unclear whether a delivery is delayed, transferred or returning another day</w:t>
+            </w:r>
+          </w:p>
+        </w:tc>
+        <w:tc>
+          <w:tcPr>
+            <w:tcW w:w="1405" w:type="dxa"/>
+            <w:vAlign w:val="center"/>
+          </w:tcPr>
+          <w:p>
+            <w:r>
+              <w:t>Medium</w:t>
+            </w:r>
+          </w:p>
+        </w:tc>
+        <w:tc>
+          <w:tcPr>
+            <w:tcW w:w="2281" w:type="dxa"/>
+            <w:vAlign w:val="center"/>
+          </w:tcPr>
+          <w:p>
+            <w:r>
+              <w:t>Request deliveries and receive delay, transfer and return notifications</w:t>
+            </w:r>
+          </w:p>
+        </w:tc>
+      </w:tr>
+      <w:tr>
+        <w:tc>
+          <w:tcPr>
+            <w:tcW w:w="1844" w:type="dxa"/>
+            <w:vAlign w:val="center"/>
+          </w:tcPr>
+          <w:p>
+            <w:r>
+              <w:t>Fleet Planner</w:t>
+            </w:r>
+          </w:p>
+        </w:tc>
+        <w:tc>
+          <w:tcPr>
+            <w:tcW w:w="1984" w:type="dxa"/>
+            <w:vAlign w:val="center"/>
+          </w:tcPr>
+          <w:p>
+            <w:r>
+              <w:t>Match vehicle availability with suitable drivers</w:t>
+            </w:r>
+          </w:p>
+        </w:tc>
+        <w:tc>
+          <w:tcPr>
+            <w:tcW w:w="2410" w:type="dxa"/>
+            <w:vAlign w:val="center"/>
+          </w:tcPr>
+          <w:p>
+            <w:r>
+              <w:t>Free vehicle but no suitable driver</w:t>
+            </w:r>
+          </w:p>
+        </w:tc>
+        <w:tc>
+          <w:tcPr>
+            <w:tcW w:w="1405" w:type="dxa"/>
+            <w:vAlign w:val="center"/>
+          </w:tcPr>
+          <w:p>
+            <w:r>
+              <w:t>High</w:t>
+            </w:r>
+          </w:p>
+        </w:tc>
+        <w:tc>
+          <w:tcPr>
+            <w:tcW w:w="2281" w:type="dxa"/>
+            <w:vAlign w:val="center"/>
+          </w:tcPr>
+          <w:p>
+            <w:r>
+              <w:t>Review vehicle and driver availability and suitability together</w:t>
+            </w:r>
+          </w:p>
+        </w:tc>
+      </w:tr>
+    </w:tbl>
+    <w:p/>
+    <w:p/>
+    <w:p/>
+    <w:p>
+      <w:pPr>
+        <w:pStyle w:val="Heading1"/>
+        <w:shd w:val="clear" w:color="auto" w:fill="FFFFFF"/>
+        <w:spacing w:before="90" w:after="90"/>
+        <w:rPr>
+          <w:rFonts w:ascii="Lato" w:hAnsi="Lato"/>
+          <w:color w:val="000000" w:themeColor="text1"/>
+        </w:rPr>
+      </w:pPr>
+      <w:r>
+        <w:rPr>
+          <w:rFonts w:ascii="Lato" w:hAnsi="Lato"/>
+          <w:color w:val="000000" w:themeColor="text1"/>
+        </w:rPr>
+        <w:t xml:space="preserve">Task </w:t>
+      </w:r>
+      <w:r>
+        <w:rPr>
+          <w:rFonts w:ascii="Lato" w:hAnsi="Lato"/>
+          <w:color w:val="000000" w:themeColor="text1"/>
+        </w:rPr>
+        <w:t>5</w:t>
+      </w:r>
+      <w:r>
+        <w:rPr>
+          <w:rFonts w:ascii="Lato" w:hAnsi="Lato"/>
+          <w:color w:val="000000" w:themeColor="text1"/>
+        </w:rPr>
+        <w:t>:</w:t>
+      </w:r>
+      <w:r>
+        <w:rPr>
+          <w:rFonts w:ascii="Lato" w:eastAsia="Times New Roman" w:hAnsi="Lato" w:cs="Times New Roman"/>
+          <w:color w:val="273540"/>
+          <w:kern w:val="36"/>
+          <w:sz w:val="43"/>
+          <w:szCs w:val="43"/>
+          <w:lang w:eastAsia="en-IE"/>
+          <w14:ligatures w14:val="none"/>
+        </w:rPr>
+        <w:t xml:space="preserve"> </w:t>
+      </w:r>
+      <w:r>
+        <w:rPr>
+          <w:rFonts w:ascii="Lato" w:hAnsi="Lato"/>
+          <w:color w:val="000000" w:themeColor="text1"/>
+        </w:rPr>
+        <w:t>Functional Requirements</w:t>
+      </w:r>
+    </w:p>
+    <w:tbl>
+      <w:tblPr>
+        <w:tblStyle w:val="TableGrid"/>
+        <w:tblW w:w="0" w:type="auto"/>
+        <w:tblLook w:val="04A0" w:firstRow="1" w:lastRow="0" w:firstColumn="1" w:lastColumn="0" w:noHBand="0" w:noVBand="1"/>
+      </w:tblPr>
+      <w:tblGrid>
+        <w:gridCol w:w="1413"/>
+        <w:gridCol w:w="4111"/>
+        <w:gridCol w:w="1238"/>
+        <w:gridCol w:w="2254"/>
+      </w:tblGrid>
+      <w:tr>
+        <w:trPr>
+          <w:trHeight w:val="623"/>
+        </w:trPr>
+        <w:tc>
+          <w:tcPr>
+            <w:tcW w:w="1413" w:type="dxa"/>
+            <w:vAlign w:val="center"/>
+          </w:tcPr>
+          <w:p>
+            <w:r>
+              <w:rPr>
+                <w:b/>
+                <w:bCs/>
+              </w:rPr>
+              <w:t>ID</w:t>
+            </w:r>
+          </w:p>
+        </w:tc>
+        <w:tc>
+          <w:tcPr>
+            <w:tcW w:w="4111" w:type="dxa"/>
+            <w:vAlign w:val="center"/>
+          </w:tcPr>
+          <w:p>
+            <w:r>
+              <w:rPr>
+                <w:b/>
+                <w:bCs/>
+              </w:rPr>
+              <w:t>Functional Requirement</w:t>
+            </w:r>
+          </w:p>
+        </w:tc>
+        <w:tc>
+          <w:tcPr>
+            <w:tcW w:w="1238" w:type="dxa"/>
+            <w:vAlign w:val="center"/>
+          </w:tcPr>
+          <w:p>
+            <w:proofErr w:type="spellStart"/>
+            <w:r>
+              <w:rPr>
+                <w:b/>
+                <w:bCs/>
+              </w:rPr>
+              <w:t>MoSCoW</w:t>
+            </w:r>
+            <w:proofErr w:type="spellEnd"/>
+          </w:p>
+        </w:tc>
+        <w:tc>
+          <w:tcPr>
+            <w:tcW w:w="2254" w:type="dxa"/>
+            <w:vAlign w:val="center"/>
+          </w:tcPr>
+          <w:p>
+            <w:r>
+              <w:rPr>
+                <w:b/>
+                <w:bCs/>
+              </w:rPr>
+              <w:t>Source / Rationale</w:t>
+            </w:r>
+          </w:p>
+        </w:tc>
+      </w:tr>
+      <w:tr>
+        <w:trPr>
+          <w:trHeight w:val="703"/>
+        </w:trPr>
+        <w:tc>
+          <w:tcPr>
+            <w:tcW w:w="1413" w:type="dxa"/>
+            <w:vAlign w:val="center"/>
+          </w:tcPr>
+          <w:p>
+            <w:r>
+              <w:t>FR01</w:t>
+            </w:r>
+          </w:p>
+        </w:tc>
+        <w:tc>
+          <w:tcPr>
+            <w:tcW w:w="4111" w:type="dxa"/>
+            <w:vAlign w:val="center"/>
+          </w:tcPr>
+          <w:p>
+            <w:r>
+              <w:t>The system shall allow authorised staff to record a delivery request, marked as provisional or confirmed</w:t>
+            </w:r>
+          </w:p>
+        </w:tc>
+        <w:tc>
+          <w:tcPr>
+            <w:tcW w:w="1238" w:type="dxa"/>
+            <w:vAlign w:val="center"/>
+          </w:tcPr>
+          <w:p>
+            <w:r>
+              <w:t>Must</w:t>
+            </w:r>
+          </w:p>
+        </w:tc>
+        <w:tc>
+          <w:tcPr>
+            <w:tcW w:w="2254" w:type="dxa"/>
+            <w:vAlign w:val="center"/>
+          </w:tcPr>
+          <w:p>
+            <w:r>
+              <w:t>Route Coordinator</w:t>
+            </w:r>
+          </w:p>
+        </w:tc>
+      </w:tr>
+      <w:tr>
+        <w:trPr>
+          <w:trHeight w:val="542"/>
+        </w:trPr>
+        <w:tc>
+          <w:tcPr>
+            <w:tcW w:w="1413" w:type="dxa"/>
+            <w:vAlign w:val="center"/>
+          </w:tcPr>
+          <w:p>
+            <w:r>
+              <w:t>FR02</w:t>
+            </w:r>
+          </w:p>
+        </w:tc>
+        <w:tc>
+          <w:tcPr>
+            <w:tcW w:w="4111" w:type="dxa"/>
+            <w:vAlign w:val="center"/>
+          </w:tcPr>
+          <w:p>
+            <w:r>
+              <w:t>The system shall allow an order to be split into several consignments and a consignment to contain goods from several orders</w:t>
+            </w:r>
+          </w:p>
+        </w:tc>
+        <w:tc>
+          <w:tcPr>
+            <w:tcW w:w="1238" w:type="dxa"/>
+            <w:vAlign w:val="center"/>
+          </w:tcPr>
+          <w:p>
+            <w:r>
+              <w:t>Must</w:t>
+            </w:r>
+          </w:p>
+        </w:tc>
+        <w:tc>
+          <w:tcPr>
+            <w:tcW w:w="2254" w:type="dxa"/>
+            <w:vAlign w:val="center"/>
+          </w:tcPr>
+          <w:p>
+            <w:r>
+              <w:t>Scenario: delivery requests</w:t>
+            </w:r>
+          </w:p>
+        </w:tc>
+      </w:tr>
+      <w:tr>
+        <w:trPr>
+          <w:trHeight w:val="564"/>
+        </w:trPr>
+        <w:tc>
+          <w:tcPr>
+            <w:tcW w:w="1413" w:type="dxa"/>
+            <w:vAlign w:val="center"/>
+          </w:tcPr>
+          <w:p>
+            <w:r>
+              <w:lastRenderedPageBreak/>
+              <w:t>FR03</w:t>
+            </w:r>
+          </w:p>
+        </w:tc>
+        <w:tc>
+          <w:tcPr>
+            <w:tcW w:w="4111" w:type="dxa"/>
+            <w:vAlign w:val="center"/>
+          </w:tcPr>
+          <w:p>
+            <w:r>
+              <w:t>The system shall show vehicle availability and driver suitability together when a route is planned</w:t>
+            </w:r>
+          </w:p>
+        </w:tc>
+        <w:tc>
+          <w:tcPr>
+            <w:tcW w:w="1238" w:type="dxa"/>
+            <w:vAlign w:val="center"/>
+          </w:tcPr>
+          <w:p>
+            <w:r>
+              <w:t>Must</w:t>
+            </w:r>
+          </w:p>
+        </w:tc>
+        <w:tc>
+          <w:tcPr>
+            <w:tcW w:w="2254" w:type="dxa"/>
+            <w:vAlign w:val="center"/>
+          </w:tcPr>
+          <w:p>
+            <w:r>
+              <w:t>Fleet Planner</w:t>
+            </w:r>
+          </w:p>
+        </w:tc>
+      </w:tr>
+      <w:tr>
+        <w:trPr>
+          <w:trHeight w:val="558"/>
+        </w:trPr>
+        <w:tc>
+          <w:tcPr>
+            <w:tcW w:w="1413" w:type="dxa"/>
+            <w:vAlign w:val="center"/>
+          </w:tcPr>
+          <w:p>
+            <w:r>
+              <w:t>FR04</w:t>
+            </w:r>
+          </w:p>
+        </w:tc>
+        <w:tc>
+          <w:tcPr>
+            <w:tcW w:w="4111" w:type="dxa"/>
+            <w:vAlign w:val="center"/>
+          </w:tcPr>
+          <w:p>
+            <w:r>
+              <w:t>The system shall alert the coordinator when planned goods exceed vehicle capacity</w:t>
+            </w:r>
+          </w:p>
+        </w:tc>
+        <w:tc>
+          <w:tcPr>
+            <w:tcW w:w="1238" w:type="dxa"/>
+            <w:vAlign w:val="center"/>
+          </w:tcPr>
+          <w:p>
+            <w:r>
+              <w:t>Must</w:t>
+            </w:r>
+          </w:p>
+        </w:tc>
+        <w:tc>
+          <w:tcPr>
+            <w:tcW w:w="2254" w:type="dxa"/>
+            <w:vAlign w:val="center"/>
+          </w:tcPr>
+          <w:p>
+            <w:r>
+              <w:t>Producer</w:t>
+            </w:r>
+          </w:p>
+        </w:tc>
+      </w:tr>
+      <w:tr>
+        <w:trPr>
+          <w:trHeight w:val="694"/>
+        </w:trPr>
+        <w:tc>
+          <w:tcPr>
+            <w:tcW w:w="1413" w:type="dxa"/>
+            <w:vAlign w:val="center"/>
+          </w:tcPr>
+          <w:p>
+            <w:r>
+              <w:t>FR05</w:t>
+            </w:r>
+          </w:p>
+        </w:tc>
+        <w:tc>
+          <w:tcPr>
+            <w:tcW w:w="4111" w:type="dxa"/>
+            <w:vAlign w:val="center"/>
+          </w:tcPr>
+          <w:p>
+            <w:r>
+              <w:t>The system shall keep a version history for each route and show drivers the current version</w:t>
+            </w:r>
+          </w:p>
+        </w:tc>
+        <w:tc>
+          <w:tcPr>
+            <w:tcW w:w="1238" w:type="dxa"/>
+            <w:vAlign w:val="center"/>
+          </w:tcPr>
+          <w:p>
+            <w:r>
+              <w:t>Must</w:t>
+            </w:r>
+          </w:p>
+        </w:tc>
+        <w:tc>
+          <w:tcPr>
+            <w:tcW w:w="2254" w:type="dxa"/>
+            <w:vAlign w:val="center"/>
+          </w:tcPr>
+          <w:p>
+            <w:r>
+              <w:t>Driver</w:t>
+            </w:r>
+          </w:p>
+        </w:tc>
+      </w:tr>
+      <w:tr>
+        <w:trPr>
+          <w:trHeight w:val="694"/>
+        </w:trPr>
+        <w:tc>
+          <w:tcPr>
+            <w:tcW w:w="1413" w:type="dxa"/>
+            <w:vAlign w:val="center"/>
+          </w:tcPr>
+          <w:p>
+            <w:r>
+              <w:t>FR06</w:t>
+            </w:r>
+          </w:p>
+        </w:tc>
+        <w:tc>
+          <w:tcPr>
+            <w:tcW w:w="4111" w:type="dxa"/>
+            <w:vAlign w:val="center"/>
+          </w:tcPr>
+          <w:p>
+            <w:r>
+              <w:t>The system shall allow depot staff to record receipt, checking and route assignment of consignments as separate statuses</w:t>
+            </w:r>
+          </w:p>
+        </w:tc>
+        <w:tc>
+          <w:tcPr>
+            <w:tcW w:w="1238" w:type="dxa"/>
+            <w:vAlign w:val="center"/>
+          </w:tcPr>
+          <w:p>
+            <w:r>
+              <w:t>Must</w:t>
+            </w:r>
+          </w:p>
+        </w:tc>
+        <w:tc>
+          <w:tcPr>
+            <w:tcW w:w="2254" w:type="dxa"/>
+            <w:vAlign w:val="center"/>
+          </w:tcPr>
+          <w:p>
+            <w:r>
+              <w:t>Depot Worker</w:t>
+            </w:r>
+          </w:p>
+        </w:tc>
+      </w:tr>
+      <w:tr>
+        <w:trPr>
+          <w:trHeight w:val="694"/>
+        </w:trPr>
+        <w:tc>
+          <w:tcPr>
+            <w:tcW w:w="1413" w:type="dxa"/>
+            <w:vAlign w:val="center"/>
+          </w:tcPr>
+          <w:p>
+            <w:r>
+              <w:t>FR07</w:t>
+            </w:r>
+          </w:p>
+        </w:tc>
+        <w:tc>
+          <w:tcPr>
+            <w:tcW w:w="4111" w:type="dxa"/>
+            <w:vAlign w:val="center"/>
+          </w:tcPr>
+          <w:p>
+            <w:r>
+              <w:t>The system shall check vehicle, driver, route, load and documents before a route is marked ready for dispatch</w:t>
+            </w:r>
+          </w:p>
+        </w:tc>
+        <w:tc>
+          <w:tcPr>
+            <w:tcW w:w="1238" w:type="dxa"/>
+            <w:vAlign w:val="center"/>
+          </w:tcPr>
+          <w:p>
+            <w:r>
+              <w:t>Must</w:t>
+            </w:r>
+          </w:p>
+        </w:tc>
+        <w:tc>
+          <w:tcPr>
+            <w:tcW w:w="2254" w:type="dxa"/>
+            <w:vAlign w:val="center"/>
+          </w:tcPr>
+          <w:p>
+            <w:r>
+              <w:t xml:space="preserve">Scenario: </w:t>
+            </w:r>
+            <w:r>
+              <w:t>dispatch</w:t>
+            </w:r>
+          </w:p>
+        </w:tc>
+      </w:tr>
+      <w:tr>
+        <w:trPr>
+          <w:trHeight w:val="694"/>
+        </w:trPr>
+        <w:tc>
+          <w:tcPr>
+            <w:tcW w:w="1413" w:type="dxa"/>
+            <w:vAlign w:val="center"/>
+          </w:tcPr>
+          <w:p>
+            <w:r>
+              <w:t>FR08</w:t>
+            </w:r>
+          </w:p>
+        </w:tc>
+        <w:tc>
+          <w:tcPr>
+            <w:tcW w:w="4111" w:type="dxa"/>
+            <w:vAlign w:val="center"/>
+          </w:tcPr>
+          <w:p>
+            <w:r>
+              <w:t>The system shall allow drivers to record delivery, partial delivery, refusal, damage or failed attempt</w:t>
+            </w:r>
+          </w:p>
+        </w:tc>
+        <w:tc>
+          <w:tcPr>
+            <w:tcW w:w="1238" w:type="dxa"/>
+            <w:vAlign w:val="center"/>
+          </w:tcPr>
+          <w:p>
+            <w:r>
+              <w:t>Must</w:t>
+            </w:r>
+          </w:p>
+        </w:tc>
+        <w:tc>
+          <w:tcPr>
+            <w:tcW w:w="2254" w:type="dxa"/>
+            <w:vAlign w:val="center"/>
+          </w:tcPr>
+          <w:p>
+            <w:r>
+              <w:t>Driver</w:t>
+            </w:r>
+          </w:p>
+        </w:tc>
+      </w:tr>
+      <w:tr>
+        <w:trPr>
+          <w:trHeight w:val="694"/>
+        </w:trPr>
+        <w:tc>
+          <w:tcPr>
+            <w:tcW w:w="1413" w:type="dxa"/>
+            <w:vAlign w:val="center"/>
+          </w:tcPr>
+          <w:p>
+            <w:r>
+              <w:t>FR09</w:t>
+            </w:r>
+          </w:p>
+        </w:tc>
+        <w:tc>
+          <w:tcPr>
+            <w:tcW w:w="4111" w:type="dxa"/>
+            <w:vAlign w:val="center"/>
+          </w:tcPr>
+          <w:p>
+            <w:r>
+              <w:t>The system shall notify customers and producers when a delivery is delayed, transferred or returning to depot</w:t>
+            </w:r>
+          </w:p>
+        </w:tc>
+        <w:tc>
+          <w:tcPr>
+            <w:tcW w:w="1238" w:type="dxa"/>
+            <w:vAlign w:val="center"/>
+          </w:tcPr>
+          <w:p>
+            <w:r>
+              <w:t>Should</w:t>
+            </w:r>
+          </w:p>
+        </w:tc>
+        <w:tc>
+          <w:tcPr>
+            <w:tcW w:w="2254" w:type="dxa"/>
+            <w:vAlign w:val="center"/>
+          </w:tcPr>
+          <w:p>
+            <w:r>
+              <w:t>Customer</w:t>
+            </w:r>
+          </w:p>
+        </w:tc>
+      </w:tr>
+      <w:tr>
+        <w:trPr>
+          <w:trHeight w:val="694"/>
+        </w:trPr>
+        <w:tc>
+          <w:tcPr>
+            <w:tcW w:w="1413" w:type="dxa"/>
+            <w:vAlign w:val="center"/>
+          </w:tcPr>
+          <w:p>
+            <w:r>
+              <w:t>FR10</w:t>
+            </w:r>
+          </w:p>
+        </w:tc>
+        <w:tc>
+          <w:tcPr>
+            <w:tcW w:w="4111" w:type="dxa"/>
+            <w:vAlign w:val="center"/>
+          </w:tcPr>
+          <w:p>
+            <w:r>
+              <w:t>The system shall allow the coordinator to generate reports on capacity conflicts, late collections, route readiness, failed deliveries and returned goods</w:t>
+            </w:r>
+          </w:p>
+        </w:tc>
+        <w:tc>
+          <w:tcPr>
+            <w:tcW w:w="1238" w:type="dxa"/>
+            <w:vAlign w:val="center"/>
+          </w:tcPr>
+          <w:p>
+            <w:r>
+              <w:t>Could</w:t>
+            </w:r>
+          </w:p>
+        </w:tc>
+        <w:tc>
+          <w:tcPr>
+            <w:tcW w:w="2254" w:type="dxa"/>
+            <w:vAlign w:val="center"/>
+          </w:tcPr>
+          <w:p>
+            <w:r>
+              <w:t>Route Coordinator</w:t>
+            </w:r>
+          </w:p>
+        </w:tc>
+      </w:tr>
+    </w:tbl>
+    <w:p/>
+    <w:p/>
+    <w:p/>
+    <w:p/>
+    <w:p>
+      <w:pPr>
+        <w:pStyle w:val="Heading1"/>
+        <w:shd w:val="clear" w:color="auto" w:fill="FFFFFF"/>
+        <w:spacing w:before="90" w:after="90"/>
+        <w:rPr>
+          <w:rFonts w:ascii="Lato" w:hAnsi="Lato"/>
+          <w:color w:val="000000" w:themeColor="text1"/>
+        </w:rPr>
+      </w:pPr>
+      <w:r>
+        <w:rPr>
+          <w:rFonts w:ascii="Lato" w:hAnsi="Lato"/>
+          <w:color w:val="000000" w:themeColor="text1"/>
+        </w:rPr>
+        <w:t xml:space="preserve">Task </w:t>
+      </w:r>
+      <w:r>
+        <w:rPr>
+          <w:rFonts w:ascii="Lato" w:hAnsi="Lato"/>
+          <w:color w:val="000000" w:themeColor="text1"/>
+        </w:rPr>
+        <w:t>6</w:t>
+      </w:r>
+      <w:r>
+        <w:rPr>
+          <w:rFonts w:ascii="Lato" w:hAnsi="Lato"/>
+          <w:color w:val="000000" w:themeColor="text1"/>
+        </w:rPr>
+        <w:t>:</w:t>
+      </w:r>
+      <w:r>
+        <w:rPr>
+          <w:rFonts w:ascii="Lato" w:eastAsia="Times New Roman" w:hAnsi="Lato" w:cs="Times New Roman"/>
+          <w:color w:val="273540"/>
+          <w:kern w:val="36"/>
+          <w:sz w:val="43"/>
+          <w:szCs w:val="43"/>
+          <w:lang w:eastAsia="en-IE"/>
+          <w14:ligatures w14:val="none"/>
+        </w:rPr>
+        <w:t xml:space="preserve"> </w:t>
+      </w:r>
+      <w:r>
+        <w:rPr>
+          <w:rFonts w:ascii="Lato" w:eastAsia="Times New Roman" w:hAnsi="Lato" w:cs="Times New Roman"/>
+          <w:color w:val="273540"/>
+          <w:kern w:val="36"/>
+          <w:sz w:val="43"/>
+          <w:szCs w:val="43"/>
+          <w:lang w:eastAsia="en-IE"/>
+          <w14:ligatures w14:val="none"/>
+        </w:rPr>
+        <w:t>Non-</w:t>
+      </w:r>
+      <w:r>
+        <w:rPr>
+          <w:rFonts w:ascii="Lato" w:hAnsi="Lato"/>
+          <w:color w:val="000000" w:themeColor="text1"/>
+        </w:rPr>
+        <w:t>Functional Requirements</w:t>
+      </w:r>
+    </w:p>
+    <w:tbl>
+      <w:tblPr>
+        <w:tblStyle w:val="TableGrid"/>
+        <w:tblW w:w="9493" w:type="dxa"/>
+        <w:tblLook w:val="04A0" w:firstRow="1" w:lastRow="0" w:firstColumn="1" w:lastColumn="0" w:noHBand="0" w:noVBand="1"/>
+      </w:tblPr>
+      <w:tblGrid>
+        <w:gridCol w:w="988"/>
+        <w:gridCol w:w="1984"/>
+        <w:gridCol w:w="4253"/>
+        <w:gridCol w:w="2268"/>
+      </w:tblGrid>
+      <w:tr>
+        <w:trPr>
+          <w:trHeight w:val="723"/>
+        </w:trPr>
+        <w:tc>
+          <w:tcPr>
+            <w:tcW w:w="988" w:type="dxa"/>
+            <w:vAlign w:val="center"/>
+          </w:tcPr>
+          <w:p>
+            <w:r>
+              <w:rPr>
+                <w:b/>
+                <w:bCs/>
+              </w:rPr>
+              <w:t>ID</w:t>
+            </w:r>
+          </w:p>
+        </w:tc>
+        <w:tc>
+          <w:tcPr>
+            <w:tcW w:w="1984" w:type="dxa"/>
+            <w:vAlign w:val="center"/>
+          </w:tcPr>
+          <w:p>
+            <w:r>
+              <w:rPr>
+                <w:b/>
+                <w:bCs/>
+              </w:rPr>
+              <w:t>Quality Category</w:t>
+            </w:r>
+          </w:p>
+        </w:tc>
+        <w:tc>
+          <w:tcPr>
+            <w:tcW w:w="4253" w:type="dxa"/>
+            <w:vAlign w:val="center"/>
+          </w:tcPr>
+          <w:p>
+            <w:r>
+              <w:rPr>
+                <w:b/>
+                <w:bCs/>
+              </w:rPr>
+              <w:t>Measurable Requirement</w:t>
+            </w:r>
+          </w:p>
+        </w:tc>
+        <w:tc>
+          <w:tcPr>
+            <w:tcW w:w="2268" w:type="dxa"/>
+            <w:vAlign w:val="center"/>
+          </w:tcPr>
+          <w:p>
+            <w:r>
+              <w:rPr>
+                <w:b/>
+                <w:bCs/>
+              </w:rPr>
+              <w:t>Rationale</w:t>
+            </w:r>
+          </w:p>
+        </w:tc>
+      </w:tr>
+      <w:tr>
+        <w:trPr>
+          <w:trHeight w:val="833"/>
+        </w:trPr>
+        <w:tc>
+          <w:tcPr>
+            <w:tcW w:w="988" w:type="dxa"/>
+            <w:vAlign w:val="center"/>
+          </w:tcPr>
+          <w:p>
+            <w:r>
+              <w:t>NFR01</w:t>
+            </w:r>
+          </w:p>
+        </w:tc>
+        <w:tc>
+          <w:tcPr>
+            <w:tcW w:w="1984" w:type="dxa"/>
+            <w:vAlign w:val="center"/>
+          </w:tcPr>
+          <w:p>
+            <w:r>
+              <w:t>Performance</w:t>
+            </w:r>
+          </w:p>
+        </w:tc>
+        <w:tc>
+          <w:tcPr>
+            <w:tcW w:w="4253" w:type="dxa"/>
+            <w:vAlign w:val="center"/>
+          </w:tcPr>
+          <w:p>
+            <w:r>
+              <w:t>Route and consignment searches shall return results within</w:t>
+            </w:r>
+            <w:r>
+              <w:t xml:space="preserve"> </w:t>
+            </w:r>
+            <w:r>
+              <w:t>3</w:t>
+            </w:r>
+            <w:r>
+              <w:t xml:space="preserve"> or less</w:t>
+            </w:r>
+            <w:r>
+              <w:t xml:space="preserve"> seconds for </w:t>
+            </w:r>
+            <w:r>
+              <w:t>most</w:t>
+            </w:r>
+            <w:r>
+              <w:t xml:space="preserve"> of requests under normal operating conditions</w:t>
+            </w:r>
+          </w:p>
+        </w:tc>
+        <w:tc>
+          <w:tcPr>
+            <w:tcW w:w="2268" w:type="dxa"/>
+            <w:vAlign w:val="center"/>
+          </w:tcPr>
+          <w:p>
+            <w:r>
+              <w:t>Supports efficient route planning</w:t>
+            </w:r>
+          </w:p>
+        </w:tc>
+      </w:tr>
+      <w:tr>
+        <w:trPr>
+          <w:trHeight w:val="702"/>
+        </w:trPr>
+        <w:tc>
+          <w:tcPr>
+            <w:tcW w:w="988" w:type="dxa"/>
+            <w:vAlign w:val="center"/>
+          </w:tcPr>
+          <w:p>
+            <w:r>
+              <w:t>NFR02</w:t>
+            </w:r>
+          </w:p>
+        </w:tc>
+        <w:tc>
+          <w:tcPr>
+            <w:tcW w:w="1984" w:type="dxa"/>
+            <w:vAlign w:val="center"/>
+          </w:tcPr>
+          <w:p>
+            <w:r>
+              <w:t>Security</w:t>
+            </w:r>
+          </w:p>
+        </w:tc>
+        <w:tc>
+          <w:tcPr>
+            <w:tcW w:w="4253" w:type="dxa"/>
+            <w:vAlign w:val="center"/>
+          </w:tcPr>
+          <w:p>
+            <w:r>
+              <w:t xml:space="preserve">Order, producer and customer information shall be accessible only to </w:t>
+            </w:r>
+            <w:r>
+              <w:lastRenderedPageBreak/>
+              <w:t>authenticated users whose role permits it</w:t>
+            </w:r>
+          </w:p>
+        </w:tc>
+        <w:tc>
+          <w:tcPr>
+            <w:tcW w:w="2268" w:type="dxa"/>
+            <w:vAlign w:val="center"/>
+          </w:tcPr>
+          <w:p>
+            <w:r>
+              <w:lastRenderedPageBreak/>
+              <w:t>Protects sensitive information</w:t>
+            </w:r>
+            <w:r>
+              <w:t>,</w:t>
+            </w:r>
+            <w:r>
+              <w:t xml:space="preserve"> driver </w:t>
+            </w:r>
+            <w:r>
+              <w:lastRenderedPageBreak/>
+              <w:t>visibility is still unconfirmed</w:t>
+            </w:r>
+          </w:p>
+        </w:tc>
+      </w:tr>
+      <w:tr>
+        <w:trPr>
+          <w:trHeight w:val="684"/>
+        </w:trPr>
+        <w:tc>
+          <w:tcPr>
+            <w:tcW w:w="988" w:type="dxa"/>
+            <w:vAlign w:val="center"/>
+          </w:tcPr>
+          <w:p>
+            <w:r>
+              <w:lastRenderedPageBreak/>
+              <w:t>NFR03</w:t>
+            </w:r>
+          </w:p>
+        </w:tc>
+        <w:tc>
+          <w:tcPr>
+            <w:tcW w:w="1984" w:type="dxa"/>
+            <w:vAlign w:val="center"/>
+          </w:tcPr>
+          <w:p>
+            <w:r>
+              <w:t>Availability</w:t>
+            </w:r>
+          </w:p>
+        </w:tc>
+        <w:tc>
+          <w:tcPr>
+            <w:tcW w:w="4253" w:type="dxa"/>
+            <w:vAlign w:val="center"/>
+          </w:tcPr>
+          <w:p>
+            <w:r>
+              <w:t>The system shall be available during depot and delivery operating hours</w:t>
+            </w:r>
+          </w:p>
+        </w:tc>
+        <w:tc>
+          <w:tcPr>
+            <w:tcW w:w="2268" w:type="dxa"/>
+            <w:vAlign w:val="center"/>
+          </w:tcPr>
+          <w:p>
+            <w:r>
+              <w:t>Supports daily operations</w:t>
+            </w:r>
+          </w:p>
+        </w:tc>
+      </w:tr>
+      <w:tr>
+        <w:trPr>
+          <w:trHeight w:val="708"/>
+        </w:trPr>
+        <w:tc>
+          <w:tcPr>
+            <w:tcW w:w="988" w:type="dxa"/>
+            <w:vAlign w:val="center"/>
+          </w:tcPr>
+          <w:p>
+            <w:r>
+              <w:t>NFR04</w:t>
+            </w:r>
+          </w:p>
+        </w:tc>
+        <w:tc>
+          <w:tcPr>
+            <w:tcW w:w="1984" w:type="dxa"/>
+            <w:vAlign w:val="center"/>
+          </w:tcPr>
+          <w:p>
+            <w:r>
+              <w:t>Reliability</w:t>
+            </w:r>
+          </w:p>
+        </w:tc>
+        <w:tc>
+          <w:tcPr>
+            <w:tcW w:w="4253" w:type="dxa"/>
+            <w:vAlign w:val="center"/>
+          </w:tcPr>
+          <w:p>
+            <w:r>
+              <w:t>Drivers shall be able to view their current route without a network connection, and changes recorded offline shall be saved within 5 minutes of connectivity returning</w:t>
+            </w:r>
+          </w:p>
+        </w:tc>
+        <w:tc>
+          <w:tcPr>
+            <w:tcW w:w="2268" w:type="dxa"/>
+            <w:vAlign w:val="center"/>
+          </w:tcPr>
+          <w:p>
+            <w:r>
+              <w:t>Connectivity is unreliable in some rural areas</w:t>
+            </w:r>
+          </w:p>
+        </w:tc>
+      </w:tr>
+      <w:tr>
+        <w:trPr>
+          <w:trHeight w:val="846"/>
+        </w:trPr>
+        <w:tc>
+          <w:tcPr>
+            <w:tcW w:w="988" w:type="dxa"/>
+            <w:vAlign w:val="center"/>
+          </w:tcPr>
+          <w:p>
+            <w:r>
+              <w:t>NFR05</w:t>
+            </w:r>
+          </w:p>
+        </w:tc>
+        <w:tc>
+          <w:tcPr>
+            <w:tcW w:w="1984" w:type="dxa"/>
+            <w:vAlign w:val="center"/>
+          </w:tcPr>
+          <w:p>
+            <w:r>
+              <w:t>Data Integrity</w:t>
+            </w:r>
+          </w:p>
+        </w:tc>
+        <w:tc>
+          <w:tcPr>
+            <w:tcW w:w="4253" w:type="dxa"/>
+            <w:vAlign w:val="center"/>
+          </w:tcPr>
+          <w:p>
+            <w:r>
+              <w:t>A route change shall be visible to all users of that route within 1 minute of being published, and each user shall be shown the version number</w:t>
+            </w:r>
+          </w:p>
+        </w:tc>
+        <w:tc>
+          <w:tcPr>
+            <w:tcW w:w="2268" w:type="dxa"/>
+            <w:vAlign w:val="center"/>
+          </w:tcPr>
+          <w:p>
+            <w:r>
+              <w:t>Prevents drivers using outdated manifests</w:t>
+            </w:r>
+          </w:p>
+        </w:tc>
+      </w:tr>
+      <w:tr>
+        <w:trPr>
+          <w:trHeight w:val="846"/>
+        </w:trPr>
+        <w:tc>
+          <w:tcPr>
+            <w:tcW w:w="988" w:type="dxa"/>
+            <w:vAlign w:val="center"/>
+          </w:tcPr>
+          <w:p>
+            <w:r>
+              <w:t>NFR06</w:t>
+            </w:r>
+          </w:p>
+        </w:tc>
+        <w:tc>
+          <w:tcPr>
+            <w:tcW w:w="1984" w:type="dxa"/>
+            <w:vAlign w:val="center"/>
+          </w:tcPr>
+          <w:p>
+            <w:r>
+              <w:t>Auditability</w:t>
+            </w:r>
+          </w:p>
+        </w:tc>
+        <w:tc>
+          <w:tcPr>
+            <w:tcW w:w="4253" w:type="dxa"/>
+            <w:vAlign w:val="center"/>
+          </w:tcPr>
+          <w:p>
+            <w:r>
+              <w:t>The system shall record the user and time of every change to a route, consignment status or delivery outcome</w:t>
+            </w:r>
+          </w:p>
+        </w:tc>
+        <w:tc>
+          <w:tcPr>
+            <w:tcW w:w="2268" w:type="dxa"/>
+            <w:vAlign w:val="center"/>
+          </w:tcPr>
+          <w:p>
+            <w:r>
+              <w:t>Supports accountability for changes and differences</w:t>
+            </w:r>
+          </w:p>
+        </w:tc>
+      </w:tr>
+    </w:tbl>
+    <w:p/>
+    <w:p/>
+    <w:p>
+      <w:pPr>
+        <w:pStyle w:val="Heading1"/>
+        <w:shd w:val="clear" w:color="auto" w:fill="FFFFFF"/>
+        <w:spacing w:before="90" w:after="90"/>
+        <w:rPr>
+          <w:rFonts w:ascii="Lato" w:hAnsi="Lato"/>
+          <w:color w:val="000000" w:themeColor="text1"/>
+        </w:rPr>
+      </w:pPr>
+      <w:r>
+        <w:rPr>
+          <w:rFonts w:ascii="Lato" w:hAnsi="Lato"/>
+          <w:color w:val="000000" w:themeColor="text1"/>
+        </w:rPr>
+        <w:t xml:space="preserve">Task </w:t>
+      </w:r>
+      <w:r>
+        <w:rPr>
+          <w:rFonts w:ascii="Lato" w:hAnsi="Lato"/>
+          <w:color w:val="000000" w:themeColor="text1"/>
+        </w:rPr>
+        <w:t>7</w:t>
+      </w:r>
+      <w:r>
+        <w:rPr>
+          <w:rFonts w:ascii="Lato" w:hAnsi="Lato"/>
+          <w:color w:val="000000" w:themeColor="text1"/>
+        </w:rPr>
+        <w:t>:</w:t>
+      </w:r>
+      <w:r>
+        <w:rPr>
+          <w:rFonts w:ascii="Lato" w:eastAsia="Times New Roman" w:hAnsi="Lato" w:cs="Times New Roman"/>
+          <w:color w:val="273540"/>
+          <w:kern w:val="36"/>
+          <w:sz w:val="43"/>
+          <w:szCs w:val="43"/>
+          <w:lang w:eastAsia="en-IE"/>
+          <w14:ligatures w14:val="none"/>
+        </w:rPr>
+        <w:t xml:space="preserve"> </w:t>
+      </w:r>
+      <w:r>
+        <w:rPr>
+          <w:rFonts w:ascii="Lato" w:eastAsia="Times New Roman" w:hAnsi="Lato" w:cs="Times New Roman"/>
+          <w:color w:val="273540"/>
+          <w:kern w:val="36"/>
+          <w:sz w:val="43"/>
+          <w:szCs w:val="43"/>
+          <w:lang w:eastAsia="en-IE"/>
+          <w14:ligatures w14:val="none"/>
+        </w:rPr>
+        <w:t>Non-</w:t>
+      </w:r>
+      <w:r>
+        <w:rPr>
+          <w:rFonts w:ascii="Lato" w:hAnsi="Lato"/>
+          <w:color w:val="000000" w:themeColor="text1"/>
+        </w:rPr>
+        <w:t>Functional Requirements</w:t>
+      </w:r>
+    </w:p>
+    <w:tbl>
+      <w:tblPr>
+        <w:tblStyle w:val="TableGrid"/>
+        <w:tblW w:w="0" w:type="auto"/>
+        <w:tblLook w:val="04A0" w:firstRow="1" w:lastRow="0" w:firstColumn="1" w:lastColumn="0" w:noHBand="0" w:noVBand="1"/>
+      </w:tblPr>
+      <w:tblGrid>
+        <w:gridCol w:w="1838"/>
+        <w:gridCol w:w="6237"/>
+      </w:tblGrid>
+      <w:tr>
+        <w:trPr>
+          <w:trHeight w:val="917"/>
+        </w:trPr>
+        <w:tc>
+          <w:tcPr>
+            <w:tcW w:w="1838" w:type="dxa"/>
+            <w:vAlign w:val="center"/>
+          </w:tcPr>
+          <w:p>
+            <w:r>
+              <w:rPr>
+                <w:b/>
+                <w:bCs/>
+              </w:rPr>
+              <w:t>Category</w:t>
+            </w:r>
+          </w:p>
+        </w:tc>
+        <w:tc>
+          <w:tcPr>
+            <w:tcW w:w="6237" w:type="dxa"/>
+            <w:vAlign w:val="center"/>
+          </w:tcPr>
+          <w:p>
+            <w:r>
+              <w:rPr>
+                <w:b/>
+                <w:bCs/>
+              </w:rPr>
+              <w:t>Statement</w:t>
+            </w:r>
+          </w:p>
+        </w:tc>
+      </w:tr>
+      <w:tr>
+        <w:trPr>
+          <w:trHeight w:val="980"/>
+        </w:trPr>
+        <w:tc>
+          <w:tcPr>
+            <w:tcW w:w="1838" w:type="dxa"/>
+            <w:vAlign w:val="center"/>
+          </w:tcPr>
+          <w:p>
+            <w:r>
+              <w:t>Business Rule</w:t>
+            </w:r>
+          </w:p>
+        </w:tc>
+        <w:tc>
+          <w:tcPr>
+            <w:tcW w:w="6237" w:type="dxa"/>
+            <w:vAlign w:val="center"/>
+          </w:tcPr>
+          <w:p>
+            <w:r>
+              <w:t>A route must not be dispatched until vehicle, driver, route, load and required documents are confirmed.</w:t>
+            </w:r>
+          </w:p>
+        </w:tc>
+      </w:tr>
+      <w:tr>
+        <w:trPr>
+          <w:trHeight w:val="846"/>
+        </w:trPr>
+        <w:tc>
+          <w:tcPr>
+            <w:tcW w:w="1838" w:type="dxa"/>
+            <w:vAlign w:val="center"/>
+          </w:tcPr>
+          <w:p>
+            <w:r>
+              <w:t>Business Rule</w:t>
+            </w:r>
+          </w:p>
+        </w:tc>
+        <w:tc>
+          <w:tcPr>
+            <w:tcW w:w="6237" w:type="dxa"/>
+            <w:vAlign w:val="center"/>
+          </w:tcPr>
+          <w:p>
+            <w:r>
+              <w:t>A vehicle assigned to a consignment must have suitable capacity, access and temperature capability for its goods.</w:t>
+            </w:r>
+          </w:p>
+        </w:tc>
+      </w:tr>
+      <w:tr>
+        <w:trPr>
+          <w:trHeight w:val="957"/>
+        </w:trPr>
+        <w:tc>
+          <w:tcPr>
+            <w:tcW w:w="1838" w:type="dxa"/>
+            <w:vAlign w:val="center"/>
+          </w:tcPr>
+          <w:p>
+            <w:r>
+              <w:t>Business Rule</w:t>
+            </w:r>
+          </w:p>
+        </w:tc>
+        <w:tc>
+          <w:tcPr>
+            <w:tcW w:w="6237" w:type="dxa"/>
+            <w:vAlign w:val="center"/>
+          </w:tcPr>
+          <w:p>
+            <w:r>
+              <w:t>A quantity or condition difference at collection or depot receipt must be recorded as accepted, held for clarification or rejected.</w:t>
+            </w:r>
+          </w:p>
+        </w:tc>
+      </w:tr>
+      <w:tr>
+        <w:trPr>
+          <w:trHeight w:val="826"/>
+        </w:trPr>
+        <w:tc>
+          <w:tcPr>
+            <w:tcW w:w="1838" w:type="dxa"/>
+            <w:vAlign w:val="center"/>
+          </w:tcPr>
+          <w:p>
+            <w:r>
+              <w:t>Constraint</w:t>
+            </w:r>
+          </w:p>
+        </w:tc>
+        <w:tc>
+          <w:tcPr>
+            <w:tcW w:w="6237" w:type="dxa"/>
+            <w:vAlign w:val="center"/>
+          </w:tcPr>
+          <w:p>
+            <w:r>
+              <w:t>Live vehicle tracking, payments and fleet maintenance are outside the scope of the system.</w:t>
+            </w:r>
+          </w:p>
+        </w:tc>
+      </w:tr>
+      <w:tr>
+        <w:trPr>
+          <w:trHeight w:val="826"/>
+        </w:trPr>
+        <w:tc>
+          <w:tcPr>
+            <w:tcW w:w="1838" w:type="dxa"/>
+            <w:vAlign w:val="center"/>
+          </w:tcPr>
+          <w:p>
+            <w:r>
+              <w:t>Constraint</w:t>
+            </w:r>
+          </w:p>
+        </w:tc>
+        <w:tc>
+          <w:tcPr>
+            <w:tcW w:w="6237" w:type="dxa"/>
+            <w:vAlign w:val="center"/>
+          </w:tcPr>
+          <w:p>
+            <w:r>
+              <w:t>The system must work for drivers in rural areas where connectivity is unreliable.</w:t>
+            </w:r>
+          </w:p>
+        </w:tc>
+      </w:tr>
+      <w:tr>
+        <w:trPr>
+          <w:trHeight w:val="826"/>
+        </w:trPr>
+        <w:tc>
+          <w:tcPr>
+            <w:tcW w:w="1838" w:type="dxa"/>
+            <w:vAlign w:val="center"/>
+          </w:tcPr>
+          <w:p>
+            <w:r>
+              <w:t>Risk</w:t>
+            </w:r>
+          </w:p>
+        </w:tc>
+        <w:tc>
+          <w:tcPr>
+            <w:tcW w:w="6237" w:type="dxa"/>
+            <w:vAlign w:val="center"/>
+          </w:tcPr>
+          <w:p>
+            <w:r>
+              <w:t>Producers’ goods information may be incomplete until collection, making capacity planning inaccurate.</w:t>
+            </w:r>
+          </w:p>
+        </w:tc>
+      </w:tr>
+      <w:tr>
+        <w:trPr>
+          <w:trHeight w:val="826"/>
+        </w:trPr>
+        <w:tc>
+          <w:tcPr>
+            <w:tcW w:w="1838" w:type="dxa"/>
+            <w:vAlign w:val="center"/>
+          </w:tcPr>
+          <w:p>
+            <w:r>
+              <w:lastRenderedPageBreak/>
+              <w:t>Risk</w:t>
+            </w:r>
+          </w:p>
+        </w:tc>
+        <w:tc>
+          <w:tcPr>
+            <w:tcW w:w="6237" w:type="dxa"/>
+            <w:vAlign w:val="center"/>
+          </w:tcPr>
+          <w:p>
+            <w:r>
+              <w:t>A late collection may disrupt several later stops on the route.</w:t>
+            </w:r>
+          </w:p>
+        </w:tc>
+      </w:tr>
+      <w:tr>
+        <w:trPr>
+          <w:trHeight w:val="826"/>
+        </w:trPr>
+        <w:tc>
+          <w:tcPr>
+            <w:tcW w:w="1838" w:type="dxa"/>
+            <w:vAlign w:val="center"/>
+          </w:tcPr>
+          <w:p>
+            <w:r>
+              <w:t>Risk</w:t>
+            </w:r>
+          </w:p>
+        </w:tc>
+        <w:tc>
+          <w:tcPr>
+            <w:tcW w:w="6237" w:type="dxa"/>
+            <w:vAlign w:val="center"/>
+          </w:tcPr>
+          <w:p>
+            <w:r>
+              <w:t>Drivers using printed manifests may keep an outdated route after it is republished.</w:t>
+            </w:r>
+          </w:p>
+        </w:tc>
+      </w:tr>
+    </w:tbl>
+    <w:p/>
+    <w:p>
+      <w:pPr>
+        <w:pStyle w:val="Heading1"/>
+        <w:shd w:val="clear" w:color="auto" w:fill="FFFFFF"/>
+        <w:spacing w:before="90" w:after="90"/>
+        <w:rPr>
+          <w:rFonts w:ascii="Lato" w:hAnsi="Lato"/>
+          <w:color w:val="000000" w:themeColor="text1"/>
+        </w:rPr>
+      </w:pPr>
+      <w:r>
+        <w:rPr>
+          <w:rFonts w:ascii="Lato" w:hAnsi="Lato"/>
+          <w:color w:val="000000" w:themeColor="text1"/>
+        </w:rPr>
+        <w:t xml:space="preserve">Task </w:t>
+      </w:r>
+      <w:r>
+        <w:rPr>
+          <w:rFonts w:ascii="Lato" w:hAnsi="Lato"/>
+          <w:color w:val="000000" w:themeColor="text1"/>
+        </w:rPr>
+        <w:t>8</w:t>
+      </w:r>
+      <w:r>
+        <w:rPr>
+          <w:rFonts w:ascii="Lato" w:hAnsi="Lato"/>
+          <w:color w:val="000000" w:themeColor="text1"/>
+        </w:rPr>
+        <w:t>:</w:t>
+      </w:r>
+      <w:r>
+        <w:rPr>
+          <w:rFonts w:ascii="Lato" w:eastAsia="Times New Roman" w:hAnsi="Lato" w:cs="Times New Roman"/>
+          <w:color w:val="273540"/>
+          <w:kern w:val="36"/>
+          <w:sz w:val="43"/>
+          <w:szCs w:val="43"/>
+          <w:lang w:eastAsia="en-IE"/>
+          <w14:ligatures w14:val="none"/>
+        </w:rPr>
+        <w:t xml:space="preserve"> </w:t>
+      </w:r>
+      <w:r>
+        <w:rPr>
+          <w:rFonts w:ascii="Lato" w:eastAsia="Times New Roman" w:hAnsi="Lato" w:cs="Times New Roman"/>
+          <w:color w:val="273540"/>
+          <w:kern w:val="36"/>
+          <w:sz w:val="43"/>
+          <w:szCs w:val="43"/>
+          <w:lang w:eastAsia="en-IE"/>
+          <w14:ligatures w14:val="none"/>
+        </w:rPr>
+        <w:t>Stakeholder Clarification Question</w:t>
+      </w:r>
+      <w:r>
+        <w:rPr>
+          <w:rFonts w:ascii="Lato" w:eastAsia="Times New Roman" w:hAnsi="Lato" w:cs="Times New Roman"/>
+          <w:color w:val="273540"/>
+          <w:kern w:val="36"/>
+          <w:sz w:val="43"/>
+          <w:szCs w:val="43"/>
+          <w:lang w:eastAsia="en-IE"/>
+          <w14:ligatures w14:val="none"/>
+        </w:rPr>
+        <w:t>s</w:t>
+      </w:r>
+    </w:p>
+    <w:p>
+      <w:pPr>
+        <w:pStyle w:val="ListParagraph"/>
+        <w:numPr>
+          <w:ilvl w:val="0"/>
+          <w:numId w:val="2"/>
+        </w:numPr>
+      </w:pPr>
+      <w:r>
+        <w:t>“</w:t>
+      </w:r>
+      <w:r>
+        <w:t>When should a provisional delivery request reserve vehicle capacity?</w:t>
+      </w:r>
+      <w:r>
+        <w:t>”</w:t>
+      </w:r>
+    </w:p>
+    <w:p>
+      <w:pPr>
+        <w:pStyle w:val="ListParagraph"/>
+        <w:numPr>
+          <w:ilvl w:val="0"/>
+          <w:numId w:val="2"/>
+        </w:numPr>
+      </w:pPr>
+      <w:r>
+        <w:t>“</w:t>
+      </w:r>
+      <w:r>
+        <w:t>Which goods and handling information must be supplied before a route can be planned?</w:t>
+      </w:r>
+      <w:r>
+        <w:t>”</w:t>
+      </w:r>
+    </w:p>
+    <w:p>
+      <w:pPr>
+        <w:pStyle w:val="ListParagraph"/>
+        <w:numPr>
+          <w:ilvl w:val="0"/>
+          <w:numId w:val="2"/>
+        </w:numPr>
+      </w:pPr>
+      <w:r>
+        <w:t>“</w:t>
+      </w:r>
+      <w:r>
+        <w:t>How should route versions be controlled, and how should drivers be told when a route changes?</w:t>
+      </w:r>
+      <w:r>
+        <w:t>”</w:t>
+      </w:r>
+    </w:p>
+    <w:p>
+      <w:pPr>
+        <w:pStyle w:val="ListParagraph"/>
+        <w:numPr>
+          <w:ilvl w:val="0"/>
+          <w:numId w:val="2"/>
+        </w:numPr>
+      </w:pPr>
+      <w:r>
+        <w:t>“</w:t>
+      </w:r>
+      <w:r>
+        <w:t>Who may accept a quantity or condition difference at collection or depot receipt?</w:t>
+      </w:r>
+      <w:r>
+        <w:t>”</w:t>
+      </w:r>
+    </w:p>
+    <w:p>
+      <w:pPr>
+        <w:pStyle w:val="ListParagraph"/>
+        <w:numPr>
+          <w:ilvl w:val="0"/>
+          <w:numId w:val="2"/>
+        </w:numPr>
+      </w:pPr>
+      <w:r>
+        <w:t>“</w:t>
+      </w:r>
+      <w:r>
+        <w:t>What must be confirmed before a planned route is ready for dispatch?</w:t>
+      </w:r>
+      <w:r>
+        <w:t>”</w:t>
+      </w:r>
+    </w:p>
+    <w:p>
+      <w:pPr>
+        <w:pStyle w:val="ListParagraph"/>
+        <w:numPr>
+          <w:ilvl w:val="0"/>
+          <w:numId w:val="2"/>
+        </w:numPr>
+      </w:pPr>
+      <w:r>
+        <w:t>“</w:t>
+      </w:r>
+      <w:r>
+        <w:t>How should failed and partial deliveries be handled, including returned goods?</w:t>
+      </w:r>
+      <w:r>
+        <w:t>”</w:t>
+      </w:r>
+    </w:p>
+    <w:p>
+      <w:pPr>
+        <w:pStyle w:val="ListParagraph"/>
+        <w:numPr>
+          <w:ilvl w:val="0"/>
+          <w:numId w:val="2"/>
+        </w:numPr>
+      </w:pPr>
+      <w:r>
+        <w:t>“</w:t>
+      </w:r>
+      <w:r>
+        <w:t>Which order, producer and customer information may drivers see?</w:t>
+      </w:r>
+      <w:r>
+        <w:t>”</w:t>
+      </w:r>
+    </w:p>
+    <w:p>
+      <w:pPr>
+        <w:pStyle w:val="ListParagraph"/>
+      </w:pPr>
+    </w:p>
+    <w:p>
+      <w:pPr>
+        <w:ind w:left="360"/>
+      </w:pPr>
+    </w:p>
     <w:sectPr>
       <w:pgSz w:w="11906" w:h="16838"/>
       <w:pgMar w:top="1440" w:right="1440" w:bottom="1440" w:left="1440" w:header="708" w:footer="708" w:gutter="0"/>
@@ -821,6 +3336,216 @@
     </w:sectPr>
   </w:body>
 </w:document>
+</file>
+
+<file path=word/numbering.xml><?xml version="1.0" encoding="utf-8"?>
+<w:numbering xmlns:wpc="http://schemas.microsoft.com/office/word/2010/wordprocessingCanvas" xmlns:cx="http://schemas.microsoft.com/office/drawing/2014/chartex" xmlns:cx1="http://schemas.microsoft.com/office/drawing/2015/9/8/chartex" xmlns:cx2="http://schemas.microsoft.com/office/drawing/2015/10/21/chartex" xmlns:cx3="http://schemas.microsoft.com/office/drawing/2016/5/9/chartex" xmlns:cx4="http://schemas.microsoft.com/office/drawing/2016/5/10/chartex" xmlns:cx5="http://schemas.microsoft.com/office/drawing/2016/5/11/chartex" xmlns:cx6="http://schemas.microsoft.com/office/drawing/2016/5/12/chartex" xmlns:cx7="http://schemas.microsoft.com/office/drawing/2016/5/13/chartex" xmlns:cx8="http://schemas.microsoft.com/office/drawing/2016/5/14/chartex" xmlns:mc="http://schemas.openxmlformats.org/markup-compatibility/2006" xmlns:aink="http://schemas.microsoft.com/office/drawing/2016/ink" xmlns:am3d="http://schemas.microsoft.com/office/drawing/2017/model3d" xmlns:o="urn:schemas-microsoft-com:office:office" xmlns:oel="http://schemas.microsoft.com/office/2019/extlst" xmlns:r="http://schemas.openxmlformats.org/officeDocument/2006/relationships" xmlns:m="http://schemas.openxmlformats.org/officeDocument/2006/math" xmlns:v="urn:schemas-microsoft-com:vml" xmlns:wp14="http://schemas.microsoft.com/office/word/2010/wordprocessingDrawing" xmlns:wp="http://schemas.openxmlformats.org/drawingml/2006/wordprocessingDrawing" xmlns:w10="urn:schemas-microsoft-com:office:word" xmlns:w="http://schemas.openxmlformats.org/wordprocessingml/2006/main" xmlns:w14="http://schemas.microsoft.com/office/word/2010/wordml" xmlns:w15="http://schemas.microsoft.com/office/word/2012/wordml" xmlns:w16cex="http://schemas.microsoft.com/office/word/2018/wordml/cex" xmlns:w16cid="http://schemas.microsoft.com/office/word/2016/wordml/cid" xmlns:w16="http://schemas.microsoft.com/office/word/2018/wordml" xmlns:w16du="http://schemas.microsoft.com/office/word/2023/wordml/word16du" xmlns:w16sdtdh="http://schemas.microsoft.com/office/word/2020/wordml/sdtdatahash" xmlns:w16sdtfl="http://schemas.microsoft.com/office/word/2024/wordml/sdtformatlock" xmlns:w16se="http://schemas.microsoft.com/office/word/2015/wordml/symex" xmlns:wpg="http://schemas.microsoft.com/office/word/2010/wordprocessingGroup" xmlns:wpi="http://schemas.microsoft.com/office/word/2010/wordprocessingInk" xmlns:wne="http://schemas.microsoft.com/office/word/2006/wordml" xmlns:wps="http://schemas.microsoft.com/office/word/2010/wordprocessingShape" mc:Ignorable="w14 w15 w16se w16cid w16 w16cex w16sdtdh w16sdtfl w16du wp14">
+  <w:abstractNum w:abstractNumId="0" w15:restartNumberingAfterBreak="0">
+    <w:nsid w:val="1CED6BDB"/>
+    <w:multiLevelType w:val="multilevel"/>
+    <w:tmpl w:val="FA0AFB42"/>
+    <w:lvl w:ilvl="0">
+      <w:start w:val="1"/>
+      <w:numFmt w:val="decimal"/>
+      <w:lvlText w:val="%1."/>
+      <w:lvlJc w:val="left"/>
+      <w:pPr>
+        <w:tabs>
+          <w:tab w:val="num" w:pos="720"/>
+        </w:tabs>
+        <w:ind w:left="720" w:hanging="360"/>
+      </w:pPr>
+    </w:lvl>
+    <w:lvl w:ilvl="1" w:tentative="1">
+      <w:start w:val="1"/>
+      <w:numFmt w:val="decimal"/>
+      <w:lvlText w:val="%2."/>
+      <w:lvlJc w:val="left"/>
+      <w:pPr>
+        <w:tabs>
+          <w:tab w:val="num" w:pos="1440"/>
+        </w:tabs>
+        <w:ind w:left="1440" w:hanging="360"/>
+      </w:pPr>
+    </w:lvl>
+    <w:lvl w:ilvl="2" w:tentative="1">
+      <w:start w:val="1"/>
+      <w:numFmt w:val="decimal"/>
+      <w:lvlText w:val="%3."/>
+      <w:lvlJc w:val="left"/>
+      <w:pPr>
+        <w:tabs>
+          <w:tab w:val="num" w:pos="2160"/>
+        </w:tabs>
+        <w:ind w:left="2160" w:hanging="360"/>
+      </w:pPr>
+    </w:lvl>
+    <w:lvl w:ilvl="3" w:tentative="1">
+      <w:start w:val="1"/>
+      <w:numFmt w:val="decimal"/>
+      <w:lvlText w:val="%4."/>
+      <w:lvlJc w:val="left"/>
+      <w:pPr>
+        <w:tabs>
+          <w:tab w:val="num" w:pos="2880"/>
+        </w:tabs>
+        <w:ind w:left="2880" w:hanging="360"/>
+      </w:pPr>
+    </w:lvl>
+    <w:lvl w:ilvl="4" w:tentative="1">
+      <w:start w:val="1"/>
+      <w:numFmt w:val="decimal"/>
+      <w:lvlText w:val="%5."/>
+      <w:lvlJc w:val="left"/>
+      <w:pPr>
+        <w:tabs>
+          <w:tab w:val="num" w:pos="3600"/>
+        </w:tabs>
+        <w:ind w:left="3600" w:hanging="360"/>
+      </w:pPr>
+    </w:lvl>
+    <w:lvl w:ilvl="5" w:tentative="1">
+      <w:start w:val="1"/>
+      <w:numFmt w:val="decimal"/>
+      <w:lvlText w:val="%6."/>
+      <w:lvlJc w:val="left"/>
+      <w:pPr>
+        <w:tabs>
+          <w:tab w:val="num" w:pos="4320"/>
+        </w:tabs>
+        <w:ind w:left="4320" w:hanging="360"/>
+      </w:pPr>
+    </w:lvl>
+    <w:lvl w:ilvl="6" w:tentative="1">
+      <w:start w:val="1"/>
+      <w:numFmt w:val="decimal"/>
+      <w:lvlText w:val="%7."/>
+      <w:lvlJc w:val="left"/>
+      <w:pPr>
+        <w:tabs>
+          <w:tab w:val="num" w:pos="5040"/>
+        </w:tabs>
+        <w:ind w:left="5040" w:hanging="360"/>
+      </w:pPr>
+    </w:lvl>
+    <w:lvl w:ilvl="7" w:tentative="1">
+      <w:start w:val="1"/>
+      <w:numFmt w:val="decimal"/>
+      <w:lvlText w:val="%8."/>
+      <w:lvlJc w:val="left"/>
+      <w:pPr>
+        <w:tabs>
+          <w:tab w:val="num" w:pos="5760"/>
+        </w:tabs>
+        <w:ind w:left="5760" w:hanging="360"/>
+      </w:pPr>
+    </w:lvl>
+    <w:lvl w:ilvl="8" w:tentative="1">
+      <w:start w:val="1"/>
+      <w:numFmt w:val="decimal"/>
+      <w:lvlText w:val="%9."/>
+      <w:lvlJc w:val="left"/>
+      <w:pPr>
+        <w:tabs>
+          <w:tab w:val="num" w:pos="6480"/>
+        </w:tabs>
+        <w:ind w:left="6480" w:hanging="360"/>
+      </w:pPr>
+    </w:lvl>
+  </w:abstractNum>
+  <w:abstractNum w:abstractNumId="1" w15:restartNumberingAfterBreak="0">
+    <w:nsid w:val="3ECF5021"/>
+    <w:multiLevelType w:val="hybridMultilevel"/>
+    <w:tmpl w:val="ABC676BE"/>
+    <w:lvl w:ilvl="0" w:tplc="1809000F">
+      <w:start w:val="1"/>
+      <w:numFmt w:val="decimal"/>
+      <w:lvlText w:val="%1."/>
+      <w:lvlJc w:val="left"/>
+      <w:pPr>
+        <w:ind w:left="720" w:hanging="360"/>
+      </w:pPr>
+    </w:lvl>
+    <w:lvl w:ilvl="1" w:tplc="18090019" w:tentative="1">
+      <w:start w:val="1"/>
+      <w:numFmt w:val="lowerLetter"/>
+      <w:lvlText w:val="%2."/>
+      <w:lvlJc w:val="left"/>
+      <w:pPr>
+        <w:ind w:left="1440" w:hanging="360"/>
+      </w:pPr>
+    </w:lvl>
+    <w:lvl w:ilvl="2" w:tplc="1809001B" w:tentative="1">
+      <w:start w:val="1"/>
+      <w:numFmt w:val="lowerRoman"/>
+      <w:lvlText w:val="%3."/>
+      <w:lvlJc w:val="right"/>
+      <w:pPr>
+        <w:ind w:left="2160" w:hanging="180"/>
+      </w:pPr>
+    </w:lvl>
+    <w:lvl w:ilvl="3" w:tplc="1809000F" w:tentative="1">
+      <w:start w:val="1"/>
+      <w:numFmt w:val="decimal"/>
+      <w:lvlText w:val="%4."/>
+      <w:lvlJc w:val="left"/>
+      <w:pPr>
+        <w:ind w:left="2880" w:hanging="360"/>
+      </w:pPr>
+    </w:lvl>
+    <w:lvl w:ilvl="4" w:tplc="18090019" w:tentative="1">
+      <w:start w:val="1"/>
+      <w:numFmt w:val="lowerLetter"/>
+      <w:lvlText w:val="%5."/>
+      <w:lvlJc w:val="left"/>
+      <w:pPr>
+        <w:ind w:left="3600" w:hanging="360"/>
+      </w:pPr>
+    </w:lvl>
+    <w:lvl w:ilvl="5" w:tplc="1809001B" w:tentative="1">
+      <w:start w:val="1"/>
+      <w:numFmt w:val="lowerRoman"/>
+      <w:lvlText w:val="%6."/>
+      <w:lvlJc w:val="right"/>
+      <w:pPr>
+        <w:ind w:left="4320" w:hanging="180"/>
+      </w:pPr>
+    </w:lvl>
+    <w:lvl w:ilvl="6" w:tplc="1809000F" w:tentative="1">
+      <w:start w:val="1"/>
+      <w:numFmt w:val="decimal"/>
+      <w:lvlText w:val="%7."/>
+      <w:lvlJc w:val="left"/>
+      <w:pPr>
+        <w:ind w:left="5040" w:hanging="360"/>
+      </w:pPr>
+    </w:lvl>
+    <w:lvl w:ilvl="7" w:tplc="18090019" w:tentative="1">
+      <w:start w:val="1"/>
+      <w:numFmt w:val="lowerLetter"/>
+      <w:lvlText w:val="%8."/>
+      <w:lvlJc w:val="left"/>
+      <w:pPr>
+        <w:ind w:left="5760" w:hanging="360"/>
+      </w:pPr>
+    </w:lvl>
+    <w:lvl w:ilvl="8" w:tplc="1809001B" w:tentative="1">
+      <w:start w:val="1"/>
+      <w:numFmt w:val="lowerRoman"/>
+      <w:lvlText w:val="%9."/>
+      <w:lvlJc w:val="right"/>
+      <w:pPr>
+        <w:ind w:left="6480" w:hanging="180"/>
+      </w:pPr>
+    </w:lvl>
+  </w:abstractNum>
+  <w:num w:numId="1" w16cid:durableId="1835415620">
+    <w:abstractNumId w:val="0"/>
+  </w:num>
+  <w:num w:numId="2" w16cid:durableId="1342853903">
+    <w:abstractNumId w:val="1"/>
+  </w:num>
+</w:numbering>
 </file>
 
 <file path=word/styles.xml><?xml version="1.0" encoding="utf-8"?>
@@ -1251,7 +3976,6 @@
     <w:next w:val="Normal"/>
     <w:link w:val="Heading2Char"/>
     <w:uiPriority w:val="9"/>
-    <w:semiHidden/>
     <w:unhideWhenUsed/>
     <w:qFormat/>
     <w:rsid w:val="00B42A28"/>
@@ -1274,7 +3998,6 @@
     <w:next w:val="Normal"/>
     <w:link w:val="Heading3Char"/>
     <w:uiPriority w:val="9"/>
-    <w:semiHidden/>
     <w:unhideWhenUsed/>
     <w:qFormat/>
     <w:rsid w:val="00B42A28"/>
@@ -1297,7 +4020,6 @@
     <w:next w:val="Normal"/>
     <w:link w:val="Heading4Char"/>
     <w:uiPriority w:val="9"/>
-    <w:semiHidden/>
     <w:unhideWhenUsed/>
     <w:qFormat/>
     <w:rsid w:val="00B42A28"/>
@@ -1467,7 +4189,6 @@
     <w:basedOn w:val="DefaultParagraphFont"/>
     <w:link w:val="Heading2"/>
     <w:uiPriority w:val="9"/>
-    <w:semiHidden/>
     <w:rsid w:val="00B42A28"/>
     <w:rPr>
       <w:rFonts w:asciiTheme="majorHAnsi" w:eastAsiaTheme="majorEastAsia" w:hAnsiTheme="majorHAnsi" w:cstheme="majorBidi"/>
@@ -1481,7 +4202,6 @@
     <w:basedOn w:val="DefaultParagraphFont"/>
     <w:link w:val="Heading3"/>
     <w:uiPriority w:val="9"/>
-    <w:semiHidden/>
     <w:rsid w:val="00B42A28"/>
     <w:rPr>
       <w:rFonts w:eastAsiaTheme="majorEastAsia" w:cstheme="majorBidi"/>
@@ -1495,7 +4215,6 @@
     <w:basedOn w:val="DefaultParagraphFont"/>
     <w:link w:val="Heading4"/>
     <w:uiPriority w:val="9"/>
-    <w:semiHidden/>
     <w:rsid w:val="00B42A28"/>
     <w:rPr>
       <w:rFonts w:eastAsiaTheme="majorEastAsia" w:cstheme="majorBidi"/>
@@ -1738,6 +4457,50 @@
       <w:color w:val="0F4761" w:themeColor="accent1" w:themeShade="BF"/>
       <w:spacing w:val="5"/>
     </w:rPr>
+  </w:style>
+  <w:style w:type="character" w:styleId="Emphasis">
+    <w:name w:val="Emphasis"/>
+    <w:basedOn w:val="DefaultParagraphFont"/>
+    <w:uiPriority w:val="20"/>
+    <w:qFormat/>
+    <w:rsid w:val="00C616D4"/>
+    <w:rPr>
+      <w:i/>
+      <w:iCs/>
+    </w:rPr>
+  </w:style>
+  <w:style w:type="character" w:styleId="BookTitle">
+    <w:name w:val="Book Title"/>
+    <w:basedOn w:val="DefaultParagraphFont"/>
+    <w:uiPriority w:val="33"/>
+    <w:qFormat/>
+    <w:rsid w:val="00C616D4"/>
+    <w:rPr>
+      <w:b/>
+      <w:bCs/>
+      <w:i/>
+      <w:iCs/>
+      <w:spacing w:val="5"/>
+    </w:rPr>
+  </w:style>
+  <w:style w:type="table" w:styleId="TableGrid">
+    <w:name w:val="Table Grid"/>
+    <w:basedOn w:val="TableNormal"/>
+    <w:uiPriority w:val="39"/>
+    <w:rsid w:val="0029330C"/>
+    <w:pPr>
+      <w:spacing w:after="0" w:line="240" w:lineRule="auto"/>
+    </w:pPr>
+    <w:tblPr>
+      <w:tblBorders>
+        <w:top w:val="single" w:sz="4" w:space="0" w:color="auto"/>
+        <w:left w:val="single" w:sz="4" w:space="0" w:color="auto"/>
+        <w:bottom w:val="single" w:sz="4" w:space="0" w:color="auto"/>
+        <w:right w:val="single" w:sz="4" w:space="0" w:color="auto"/>
+        <w:insideH w:val="single" w:sz="4" w:space="0" w:color="auto"/>
+        <w:insideV w:val="single" w:sz="4" w:space="0" w:color="auto"/>
+      </w:tblBorders>
+    </w:tblPr>
   </w:style>
 </w:styles>
 </file>
@@ -2058,6 +4821,18 @@
 </file>
 
 <file path=customXml/item1.xml><?xml version="1.0" encoding="utf-8"?>
+<b:Sources xmlns:b="http://schemas.openxmlformats.org/officeDocument/2006/bibliography" xmlns="http://schemas.openxmlformats.org/officeDocument/2006/bibliography" SelectedStyle="\APASixthEditionOfficeOnline.xsl" StyleName="APA" Version="6"/>
+</file>
+
+<file path=customXml/item2.xml><?xml version="1.0" encoding="utf-8"?>
+<p:properties xmlns:p="http://schemas.microsoft.com/office/2006/metadata/properties" xmlns:xsi="http://www.w3.org/2001/XMLSchema-instance" xmlns:pc="http://schemas.microsoft.com/office/infopath/2007/PartnerControls">
+  <documentManagement>
+    <_activity xmlns="bfc93288-f37a-404a-be9d-db7c138e9521" xsi:nil="true"/>
+  </documentManagement>
+</p:properties>
+</file>
+
+<file path=customXml/item3.xml><?xml version="1.0" encoding="utf-8"?>
 <ct:contentTypeSchema xmlns:ct="http://schemas.microsoft.com/office/2006/metadata/contentType" xmlns:ma="http://schemas.microsoft.com/office/2006/metadata/properties/metaAttributes" ct:_="" ma:_="" ma:contentTypeName="Document" ma:contentTypeID="0x010100F90E97B579915F42A88231340D0C3235" ma:contentTypeVersion="10" ma:contentTypeDescription="Create a new document." ma:contentTypeScope="" ma:versionID="598b1d82f14cc3d1801d8e7916b0c040">
   <xsd:schema xmlns:xsd="http://www.w3.org/2001/XMLSchema" xmlns:xs="http://www.w3.org/2001/XMLSchema" xmlns:p="http://schemas.microsoft.com/office/2006/metadata/properties" xmlns:ns3="bfc93288-f37a-404a-be9d-db7c138e9521" targetNamespace="http://schemas.microsoft.com/office/2006/metadata/properties" ma:root="true" ma:fieldsID="33844c3a0708cdd21819cd3c48b5a75a" ns3:_="">
     <xsd:import namespace="bfc93288-f37a-404a-be9d-db7c138e9521"/>
@@ -2239,7 +5014,7 @@
 </ct:contentTypeSchema>
 </file>
 
-<file path=customXml/item2.xml><?xml version="1.0" encoding="utf-8"?>
+<file path=customXml/item4.xml><?xml version="1.0" encoding="utf-8"?>
 <?mso-contentType ?>
 <FormTemplates xmlns="http://schemas.microsoft.com/sharepoint/v3/contenttype/forms">
   <Display>DocumentLibraryForm</Display>
@@ -2248,15 +5023,31 @@
 </FormTemplates>
 </file>
 
-<file path=customXml/item3.xml><?xml version="1.0" encoding="utf-8"?>
-<p:properties xmlns:p="http://schemas.microsoft.com/office/2006/metadata/properties" xmlns:xsi="http://www.w3.org/2001/XMLSchema-instance" xmlns:pc="http://schemas.microsoft.com/office/infopath/2007/PartnerControls">
-  <documentManagement>
-    <_activity xmlns="bfc93288-f37a-404a-be9d-db7c138e9521" xsi:nil="true"/>
-  </documentManagement>
-</p:properties>
+<file path=customXml/itemProps1.xml><?xml version="1.0" encoding="utf-8"?>
+<ds:datastoreItem xmlns:ds="http://schemas.openxmlformats.org/officeDocument/2006/customXml" ds:itemID="{3F27894C-6D80-4E9A-8ADA-0D8418CF2C50}">
+  <ds:schemaRefs>
+    <ds:schemaRef ds:uri="http://schemas.openxmlformats.org/officeDocument/2006/bibliography"/>
+  </ds:schemaRefs>
+</ds:datastoreItem>
 </file>
 
-<file path=customXml/itemProps1.xml><?xml version="1.0" encoding="utf-8"?>
+<file path=customXml/itemProps2.xml><?xml version="1.0" encoding="utf-8"?>
+<ds:datastoreItem xmlns:ds="http://schemas.openxmlformats.org/officeDocument/2006/customXml" ds:itemID="{7F2924E0-4A4B-496A-9CC6-256D68F9D546}">
+  <ds:schemaRefs>
+    <ds:schemaRef ds:uri="bfc93288-f37a-404a-be9d-db7c138e9521"/>
+    <ds:schemaRef ds:uri="http://purl.org/dc/elements/1.1/"/>
+    <ds:schemaRef ds:uri="http://www.w3.org/XML/1998/namespace"/>
+    <ds:schemaRef ds:uri="http://schemas.microsoft.com/office/2006/documentManagement/types"/>
+    <ds:schemaRef ds:uri="http://schemas.microsoft.com/office/2006/metadata/properties"/>
+    <ds:schemaRef ds:uri="http://purl.org/dc/terms/"/>
+    <ds:schemaRef ds:uri="http://schemas.openxmlformats.org/package/2006/metadata/core-properties"/>
+    <ds:schemaRef ds:uri="http://purl.org/dc/dcmitype/"/>
+    <ds:schemaRef ds:uri="http://schemas.microsoft.com/office/infopath/2007/PartnerControls"/>
+  </ds:schemaRefs>
+</ds:datastoreItem>
+</file>
+
+<file path=customXml/itemProps3.xml><?xml version="1.0" encoding="utf-8"?>
 <ds:datastoreItem xmlns:ds="http://schemas.openxmlformats.org/officeDocument/2006/customXml" ds:itemID="{49DF8879-6850-40DD-AC5D-548718E3AD60}">
   <ds:schemaRefs>
     <ds:schemaRef ds:uri="http://schemas.microsoft.com/office/2006/metadata/contentType"/>
@@ -2274,7 +5065,7 @@
 </ds:datastoreItem>
 </file>
 
-<file path=customXml/itemProps2.xml><?xml version="1.0" encoding="utf-8"?>
+<file path=customXml/itemProps4.xml><?xml version="1.0" encoding="utf-8"?>
 <ds:datastoreItem xmlns:ds="http://schemas.openxmlformats.org/officeDocument/2006/customXml" ds:itemID="{33513310-0BB3-4594-B637-6BF4D40C3A30}">
   <ds:schemaRefs>
     <ds:schemaRef ds:uri="http://schemas.microsoft.com/sharepoint/v3/contenttype/forms"/>
@@ -2282,12 +5073,8 @@
 </ds:datastoreItem>
 </file>
 
-<file path=customXml/itemProps3.xml><?xml version="1.0" encoding="utf-8"?>
-<ds:datastoreItem xmlns:ds="http://schemas.openxmlformats.org/officeDocument/2006/customXml" ds:itemID="{7F2924E0-4A4B-496A-9CC6-256D68F9D546}">
-  <ds:schemaRefs>
-    <ds:schemaRef ds:uri="http://schemas.microsoft.com/office/2006/metadata/properties"/>
-    <ds:schemaRef ds:uri="http://schemas.microsoft.com/office/infopath/2007/PartnerControls"/>
-    <ds:schemaRef ds:uri="bfc93288-f37a-404a-be9d-db7c138e9521"/>
-  </ds:schemaRefs>
-</ds:datastoreItem>
+<file path=docMetadata/LabelInfo.xml><?xml version="1.0" encoding="utf-8"?>
+<clbl:labelList xmlns:clbl="http://schemas.microsoft.com/office/2020/mipLabelMetadata">
+  <clbl:label id="{845ee061-0700-412a-90f5-1465fb9a39f1}" enabled="0" method="" siteId="{845ee061-0700-412a-90f5-1465fb9a39f1}" removed="1"/>
+</clbl:labelList>
 </file>
</xml_diff>